<commit_message>
restyle Algorithm4: table layout, 24 lines, colored step comments, NULL consistency
</commit_message>
<xml_diff>
--- a/src/tinycua/docs/pseudocode/Algorithm4_Task_Processing.docx
+++ b/src/tinycua/docs/pseudocode/Algorithm4_Task_Processing.docx
@@ -12,13 +12,12 @@
     </w:p>
     <w:p>
       <w:pPr>
-        <w:spacing w:after="40" w:before="80" w:line="280" w:lineRule="exact"/>
+        <w:spacing w:after="40" w:before="40" w:line="280" w:lineRule="exact"/>
       </w:pPr>
       <w:r>
         <w:rPr>
           <w:rFonts w:ascii="Times New Roman" w:hAnsi="Times New Roman"/>
           <w:b/>
-          <w:i w:val="0"/>
           <w:sz w:val="20"/>
         </w:rPr>
         <w:t>Algorithm 4</w:t>
@@ -26,8 +25,6 @@
       <w:r>
         <w:rPr>
           <w:rFonts w:ascii="Times New Roman" w:hAnsi="Times New Roman"/>
-          <w:b w:val="0"/>
-          <w:i w:val="0"/>
           <w:sz w:val="20"/>
         </w:rPr>
         <w:t xml:space="preserve">  Task Processing</w:t>
@@ -41,1514 +38,2178 @@
         </w:pBdr>
       </w:pPr>
     </w:p>
-    <w:p>
-      <w:pPr>
-        <w:spacing w:after="0" w:before="0" w:line="280" w:lineRule="exact"/>
-        <w:ind w:left="0"/>
-      </w:pPr>
-      <w:r>
-        <w:rPr>
-          <w:rFonts w:ascii="Times New Roman" w:hAnsi="Times New Roman"/>
-          <w:b w:val="0"/>
-          <w:i w:val="0"/>
-          <w:sz w:val="20"/>
-        </w:rPr>
-        <w:t>// Step 1: Task Creation</w:t>
-      </w:r>
-    </w:p>
-    <w:p>
-      <w:pPr>
-        <w:spacing w:after="0" w:before="0" w:line="280" w:lineRule="exact"/>
-        <w:ind w:left="0"/>
-      </w:pPr>
-      <w:r>
-        <w:rPr>
-          <w:rFonts w:ascii="Times New Roman" w:hAnsi="Times New Roman"/>
-          <w:b w:val="0"/>
-          <w:i w:val="0"/>
-          <w:sz w:val="20"/>
-        </w:rPr>
-        <w:t xml:space="preserve">1:  </w:t>
-      </w:r>
-      <w:r>
-        <w:rPr>
-          <w:rFonts w:ascii="Times New Roman" w:hAnsi="Times New Roman"/>
-          <w:b/>
-          <w:i w:val="0"/>
-          <w:sz w:val="20"/>
-        </w:rPr>
-        <w:t>if</w:t>
-      </w:r>
-      <w:r>
-        <w:rPr>
-          <w:rFonts w:ascii="Times New Roman" w:hAnsi="Times New Roman"/>
-          <w:b w:val="0"/>
-          <w:i w:val="0"/>
-          <w:sz w:val="20"/>
-        </w:rPr>
-        <w:t xml:space="preserve"> route = task_creation </w:t>
-      </w:r>
-      <w:r>
-        <w:rPr>
-          <w:rFonts w:ascii="Times New Roman" w:hAnsi="Times New Roman"/>
-          <w:b/>
-          <w:i w:val="0"/>
-          <w:sz w:val="20"/>
-        </w:rPr>
-        <w:t>then</w:t>
-      </w:r>
-    </w:p>
-    <w:p>
-      <w:pPr>
-        <w:spacing w:after="0" w:before="0" w:line="280" w:lineRule="exact"/>
-        <w:ind w:left="283"/>
-      </w:pPr>
-      <w:r>
-        <w:rPr>
-          <w:rFonts w:ascii="Times New Roman" w:hAnsi="Times New Roman"/>
-          <w:b w:val="0"/>
-          <w:i w:val="0"/>
-          <w:sz w:val="20"/>
-        </w:rPr>
-        <w:t xml:space="preserve">2:  </w:t>
-      </w:r>
-      <w:r>
-        <w:rPr>
-          <w:rFonts w:ascii="Times New Roman" w:hAnsi="Times New Roman"/>
-          <w:b w:val="0"/>
-          <w:i w:val="0"/>
-          <w:sz w:val="20"/>
-        </w:rPr>
-        <w:t xml:space="preserve">rootTask, summary </w:t>
-      </w:r>
-      <w:r>
-        <w:rPr>
-          <w:rFonts w:ascii="Times New Roman" w:hAnsi="Times New Roman"/>
-          <w:b w:val="0"/>
-          <w:i w:val="0"/>
-          <w:sz w:val="20"/>
-        </w:rPr>
-        <w:t>←</w:t>
-      </w:r>
-      <w:r>
-        <w:rPr>
-          <w:rFonts w:ascii="Times New Roman" w:hAnsi="Times New Roman"/>
-          <w:b w:val="0"/>
-          <w:i w:val="0"/>
-          <w:sz w:val="20"/>
-        </w:rPr>
-        <w:t xml:space="preserve"> TaskCreate(query)</w:t>
-      </w:r>
-    </w:p>
-    <w:p>
-      <w:pPr>
-        <w:spacing w:after="0" w:before="0" w:line="280" w:lineRule="exact"/>
-        <w:ind w:left="0"/>
-      </w:pPr>
-      <w:r>
-        <w:rPr>
-          <w:rFonts w:ascii="Times New Roman" w:hAnsi="Times New Roman"/>
-          <w:b w:val="0"/>
-          <w:i w:val="0"/>
-          <w:sz w:val="20"/>
-        </w:rPr>
-        <w:t xml:space="preserve">3:  </w:t>
-      </w:r>
-      <w:r>
-        <w:rPr>
-          <w:rFonts w:ascii="Times New Roman" w:hAnsi="Times New Roman"/>
-          <w:b/>
-          <w:i w:val="0"/>
-          <w:sz w:val="20"/>
-        </w:rPr>
-        <w:t>end</w:t>
-      </w:r>
-      <w:r>
-        <w:rPr>
-          <w:rFonts w:ascii="Times New Roman" w:hAnsi="Times New Roman"/>
-          <w:b w:val="0"/>
-          <w:i w:val="0"/>
-          <w:sz w:val="20"/>
-        </w:rPr>
-        <w:t xml:space="preserve"> </w:t>
-      </w:r>
-      <w:r>
-        <w:rPr>
-          <w:rFonts w:ascii="Times New Roman" w:hAnsi="Times New Roman"/>
-          <w:b/>
-          <w:i w:val="0"/>
-          <w:sz w:val="20"/>
-        </w:rPr>
-        <w:t>if</w:t>
-      </w:r>
-    </w:p>
-    <w:p>
-      <w:pPr>
-        <w:spacing w:after="0" w:before="0" w:line="240" w:lineRule="exact"/>
-      </w:pPr>
-    </w:p>
-    <w:p>
-      <w:pPr>
-        <w:spacing w:after="0" w:before="0" w:line="280" w:lineRule="exact"/>
-        <w:ind w:left="0"/>
-      </w:pPr>
-      <w:r>
-        <w:rPr>
-          <w:rFonts w:ascii="Times New Roman" w:hAnsi="Times New Roman"/>
-          <w:b w:val="0"/>
-          <w:i w:val="0"/>
-          <w:sz w:val="20"/>
-        </w:rPr>
-        <w:t>// Step 2: Initial Decomposition</w:t>
-      </w:r>
-    </w:p>
-    <w:p>
-      <w:pPr>
-        <w:spacing w:after="0" w:before="0" w:line="280" w:lineRule="exact"/>
-        <w:ind w:left="0"/>
-      </w:pPr>
-      <w:r>
-        <w:rPr>
-          <w:rFonts w:ascii="Times New Roman" w:hAnsi="Times New Roman"/>
-          <w:b w:val="0"/>
-          <w:i w:val="0"/>
-          <w:sz w:val="20"/>
-        </w:rPr>
-        <w:t xml:space="preserve">4:  </w:t>
-      </w:r>
-      <w:r>
-        <w:rPr>
-          <w:rFonts w:ascii="Times New Roman" w:hAnsi="Times New Roman"/>
-          <w:b w:val="0"/>
-          <w:i w:val="0"/>
-          <w:sz w:val="20"/>
-        </w:rPr>
-        <w:t>TaskAnalyze(rootTask, initial_analysis)</w:t>
-      </w:r>
-    </w:p>
-    <w:p>
-      <w:pPr>
-        <w:spacing w:after="0" w:before="0" w:line="240" w:lineRule="exact"/>
-      </w:pPr>
-    </w:p>
-    <w:p>
-      <w:pPr>
-        <w:spacing w:after="0" w:before="0" w:line="280" w:lineRule="exact"/>
-        <w:ind w:left="0"/>
-      </w:pPr>
-      <w:r>
-        <w:rPr>
-          <w:rFonts w:ascii="Times New Roman" w:hAnsi="Times New Roman"/>
-          <w:b w:val="0"/>
-          <w:i w:val="0"/>
-          <w:sz w:val="20"/>
-        </w:rPr>
-        <w:t>// Step 3: Effort-Gated Analysis Loop</w:t>
-      </w:r>
-    </w:p>
-    <w:p>
-      <w:pPr>
-        <w:spacing w:after="0" w:before="0" w:line="280" w:lineRule="exact"/>
-        <w:ind w:left="0"/>
-      </w:pPr>
-      <w:r>
-        <w:rPr>
-          <w:rFonts w:ascii="Times New Roman" w:hAnsi="Times New Roman"/>
-          <w:b w:val="0"/>
-          <w:i w:val="0"/>
-          <w:sz w:val="20"/>
-        </w:rPr>
-        <w:t xml:space="preserve">5:  </w:t>
-      </w:r>
-      <w:r>
-        <w:rPr>
-          <w:rFonts w:ascii="Times New Roman" w:hAnsi="Times New Roman"/>
-          <w:b w:val="0"/>
-          <w:i w:val="0"/>
-          <w:sz w:val="20"/>
-        </w:rPr>
-        <w:t xml:space="preserve">pass </w:t>
-      </w:r>
-      <w:r>
-        <w:rPr>
-          <w:rFonts w:ascii="Times New Roman" w:hAnsi="Times New Roman"/>
-          <w:b w:val="0"/>
-          <w:i w:val="0"/>
-          <w:sz w:val="20"/>
-        </w:rPr>
-        <w:t>←</w:t>
-      </w:r>
-      <w:r>
-        <w:rPr>
-          <w:rFonts w:ascii="Times New Roman" w:hAnsi="Times New Roman"/>
-          <w:b w:val="0"/>
-          <w:i w:val="0"/>
-          <w:sz w:val="20"/>
-        </w:rPr>
-        <w:t xml:space="preserve"> 0</w:t>
-      </w:r>
-    </w:p>
-    <w:p>
-      <w:pPr>
-        <w:spacing w:after="0" w:before="0" w:line="280" w:lineRule="exact"/>
-        <w:ind w:left="0"/>
-      </w:pPr>
-      <w:r>
-        <w:rPr>
-          <w:rFonts w:ascii="Times New Roman" w:hAnsi="Times New Roman"/>
-          <w:b w:val="0"/>
-          <w:i w:val="0"/>
-          <w:sz w:val="20"/>
-        </w:rPr>
-        <w:t xml:space="preserve">6:  </w:t>
-      </w:r>
-      <w:r>
-        <w:rPr>
-          <w:rFonts w:ascii="Times New Roman" w:hAnsi="Times New Roman"/>
-          <w:b/>
-          <w:i w:val="0"/>
-          <w:sz w:val="20"/>
-        </w:rPr>
-        <w:t>while</w:t>
-      </w:r>
-      <w:r>
-        <w:rPr>
-          <w:rFonts w:ascii="Times New Roman" w:hAnsi="Times New Roman"/>
-          <w:b w:val="0"/>
-          <w:i w:val="0"/>
-          <w:sz w:val="20"/>
-        </w:rPr>
-        <w:t xml:space="preserve"> AnalysisEffort(effort, pass) = continue </w:t>
-      </w:r>
-      <w:r>
-        <w:rPr>
-          <w:rFonts w:ascii="Times New Roman" w:hAnsi="Times New Roman"/>
-          <w:b/>
-          <w:i w:val="0"/>
-          <w:sz w:val="20"/>
-        </w:rPr>
-        <w:t>do</w:t>
-      </w:r>
-    </w:p>
-    <w:p>
-      <w:pPr>
-        <w:spacing w:after="0" w:before="0" w:line="280" w:lineRule="exact"/>
-        <w:ind w:left="283"/>
-      </w:pPr>
-      <w:r>
-        <w:rPr>
-          <w:rFonts w:ascii="Times New Roman" w:hAnsi="Times New Roman"/>
-          <w:b w:val="0"/>
-          <w:i w:val="0"/>
-          <w:sz w:val="20"/>
-        </w:rPr>
-        <w:t xml:space="preserve">7:  </w:t>
-      </w:r>
-      <w:r>
-        <w:rPr>
-          <w:rFonts w:ascii="Times New Roman" w:hAnsi="Times New Roman"/>
-          <w:b w:val="0"/>
-          <w:i w:val="0"/>
-          <w:sz w:val="20"/>
-        </w:rPr>
-        <w:t xml:space="preserve">selected </w:t>
-      </w:r>
-      <w:r>
-        <w:rPr>
-          <w:rFonts w:ascii="Times New Roman" w:hAnsi="Times New Roman"/>
-          <w:b w:val="0"/>
-          <w:i w:val="0"/>
-          <w:sz w:val="20"/>
-        </w:rPr>
-        <w:t>←</w:t>
-      </w:r>
-      <w:r>
-        <w:rPr>
-          <w:rFonts w:ascii="Times New Roman" w:hAnsi="Times New Roman"/>
-          <w:b w:val="0"/>
-          <w:i w:val="0"/>
-          <w:sz w:val="20"/>
-        </w:rPr>
-        <w:t xml:space="preserve"> TaskAssess(rootTask)</w:t>
-      </w:r>
-    </w:p>
-    <w:p>
-      <w:pPr>
-        <w:spacing w:after="0" w:before="0" w:line="280" w:lineRule="exact"/>
-        <w:ind w:left="283"/>
-      </w:pPr>
-      <w:r>
-        <w:rPr>
-          <w:rFonts w:ascii="Times New Roman" w:hAnsi="Times New Roman"/>
-          <w:b w:val="0"/>
-          <w:i w:val="0"/>
-          <w:sz w:val="20"/>
-        </w:rPr>
-        <w:t xml:space="preserve">8:  </w:t>
-      </w:r>
-      <w:r>
-        <w:rPr>
-          <w:rFonts w:ascii="Times New Roman" w:hAnsi="Times New Roman"/>
-          <w:b/>
-          <w:i w:val="0"/>
-          <w:sz w:val="20"/>
-        </w:rPr>
-        <w:t>if</w:t>
-      </w:r>
-      <w:r>
-        <w:rPr>
-          <w:rFonts w:ascii="Times New Roman" w:hAnsi="Times New Roman"/>
-          <w:b w:val="0"/>
-          <w:i w:val="0"/>
-          <w:sz w:val="20"/>
-        </w:rPr>
-        <w:t xml:space="preserve"> selected = </w:t>
-      </w:r>
-      <w:r>
-        <w:rPr>
-          <w:rFonts w:ascii="Times New Roman" w:hAnsi="Times New Roman"/>
-          <w:b w:val="0"/>
-          <w:i w:val="0"/>
-          <w:sz w:val="20"/>
-        </w:rPr>
-        <w:t>∅</w:t>
-      </w:r>
-      <w:r>
-        <w:rPr>
-          <w:rFonts w:ascii="Times New Roman" w:hAnsi="Times New Roman"/>
-          <w:b w:val="0"/>
-          <w:i w:val="0"/>
-          <w:sz w:val="20"/>
-        </w:rPr>
-        <w:t xml:space="preserve"> </w:t>
-      </w:r>
-      <w:r>
-        <w:rPr>
-          <w:rFonts w:ascii="Times New Roman" w:hAnsi="Times New Roman"/>
-          <w:b/>
-          <w:i w:val="0"/>
-          <w:sz w:val="20"/>
-        </w:rPr>
-        <w:t>then</w:t>
-      </w:r>
-    </w:p>
-    <w:p>
-      <w:pPr>
-        <w:spacing w:after="0" w:before="0" w:line="280" w:lineRule="exact"/>
-        <w:ind w:left="567"/>
-      </w:pPr>
-      <w:r>
-        <w:rPr>
-          <w:rFonts w:ascii="Times New Roman" w:hAnsi="Times New Roman"/>
-          <w:b w:val="0"/>
-          <w:i w:val="0"/>
-          <w:sz w:val="20"/>
-        </w:rPr>
-        <w:t xml:space="preserve">9:  </w:t>
-      </w:r>
-      <w:r>
-        <w:rPr>
-          <w:rFonts w:ascii="Times New Roman" w:hAnsi="Times New Roman"/>
-          <w:b/>
-          <w:i w:val="0"/>
-          <w:sz w:val="20"/>
-        </w:rPr>
-        <w:t>break</w:t>
-      </w:r>
-    </w:p>
-    <w:p>
-      <w:pPr>
-        <w:spacing w:after="0" w:before="0" w:line="280" w:lineRule="exact"/>
-        <w:ind w:left="283"/>
-      </w:pPr>
-      <w:r>
-        <w:rPr>
-          <w:rFonts w:ascii="Times New Roman" w:hAnsi="Times New Roman"/>
-          <w:b w:val="0"/>
-          <w:i w:val="0"/>
-          <w:sz w:val="20"/>
-        </w:rPr>
-        <w:t xml:space="preserve">10: </w:t>
-      </w:r>
-      <w:r>
-        <w:rPr>
-          <w:rFonts w:ascii="Times New Roman" w:hAnsi="Times New Roman"/>
-          <w:b/>
-          <w:i w:val="0"/>
-          <w:sz w:val="20"/>
-        </w:rPr>
-        <w:t>end</w:t>
-      </w:r>
-      <w:r>
-        <w:rPr>
-          <w:rFonts w:ascii="Times New Roman" w:hAnsi="Times New Roman"/>
-          <w:b w:val="0"/>
-          <w:i w:val="0"/>
-          <w:sz w:val="20"/>
-        </w:rPr>
-        <w:t xml:space="preserve"> </w:t>
-      </w:r>
-      <w:r>
-        <w:rPr>
-          <w:rFonts w:ascii="Times New Roman" w:hAnsi="Times New Roman"/>
-          <w:b/>
-          <w:i w:val="0"/>
-          <w:sz w:val="20"/>
-        </w:rPr>
-        <w:t>if</w:t>
-      </w:r>
-    </w:p>
-    <w:p>
-      <w:pPr>
-        <w:spacing w:after="0" w:before="0" w:line="280" w:lineRule="exact"/>
-        <w:ind w:left="283"/>
-      </w:pPr>
-      <w:r>
-        <w:rPr>
-          <w:rFonts w:ascii="Times New Roman" w:hAnsi="Times New Roman"/>
-          <w:b w:val="0"/>
-          <w:i w:val="0"/>
-          <w:sz w:val="20"/>
-        </w:rPr>
-        <w:t xml:space="preserve">11: </w:t>
-      </w:r>
-      <w:r>
-        <w:rPr>
-          <w:rFonts w:ascii="Times New Roman" w:hAnsi="Times New Roman"/>
-          <w:b w:val="0"/>
-          <w:i w:val="0"/>
-          <w:sz w:val="20"/>
-        </w:rPr>
-        <w:t xml:space="preserve">TaskAnalyze(selected, effort_loop);   pass </w:t>
-      </w:r>
-      <w:r>
-        <w:rPr>
-          <w:rFonts w:ascii="Times New Roman" w:hAnsi="Times New Roman"/>
-          <w:b w:val="0"/>
-          <w:i w:val="0"/>
-          <w:sz w:val="20"/>
-        </w:rPr>
-        <w:t>←</w:t>
-      </w:r>
-      <w:r>
-        <w:rPr>
-          <w:rFonts w:ascii="Times New Roman" w:hAnsi="Times New Roman"/>
-          <w:b w:val="0"/>
-          <w:i w:val="0"/>
-          <w:sz w:val="20"/>
-        </w:rPr>
-        <w:t xml:space="preserve"> pass + 1</w:t>
-      </w:r>
-    </w:p>
-    <w:p>
-      <w:pPr>
-        <w:spacing w:after="0" w:before="0" w:line="280" w:lineRule="exact"/>
-        <w:ind w:left="0"/>
-      </w:pPr>
-      <w:r>
-        <w:rPr>
-          <w:rFonts w:ascii="Times New Roman" w:hAnsi="Times New Roman"/>
-          <w:b w:val="0"/>
-          <w:i w:val="0"/>
-          <w:sz w:val="20"/>
-        </w:rPr>
-        <w:t xml:space="preserve">12: </w:t>
-      </w:r>
-      <w:r>
-        <w:rPr>
-          <w:rFonts w:ascii="Times New Roman" w:hAnsi="Times New Roman"/>
-          <w:b/>
-          <w:i w:val="0"/>
-          <w:sz w:val="20"/>
-        </w:rPr>
-        <w:t>end</w:t>
-      </w:r>
-      <w:r>
-        <w:rPr>
-          <w:rFonts w:ascii="Times New Roman" w:hAnsi="Times New Roman"/>
-          <w:b w:val="0"/>
-          <w:i w:val="0"/>
-          <w:sz w:val="20"/>
-        </w:rPr>
-        <w:t xml:space="preserve"> </w:t>
-      </w:r>
-      <w:r>
-        <w:rPr>
-          <w:rFonts w:ascii="Times New Roman" w:hAnsi="Times New Roman"/>
-          <w:b/>
-          <w:i w:val="0"/>
-          <w:sz w:val="20"/>
-        </w:rPr>
-        <w:t>while</w:t>
-      </w:r>
-    </w:p>
-    <w:p>
-      <w:pPr>
-        <w:spacing w:after="0" w:before="0" w:line="240" w:lineRule="exact"/>
-      </w:pPr>
-    </w:p>
-    <w:p>
-      <w:pPr>
-        <w:spacing w:after="0" w:before="0" w:line="280" w:lineRule="exact"/>
-        <w:ind w:left="0"/>
-      </w:pPr>
-      <w:r>
-        <w:rPr>
-          <w:rFonts w:ascii="Times New Roman" w:hAnsi="Times New Roman"/>
-          <w:b w:val="0"/>
-          <w:i w:val="0"/>
-          <w:sz w:val="20"/>
-        </w:rPr>
-        <w:t>// Step 4: Execute and Review Loop</w:t>
-      </w:r>
-    </w:p>
-    <w:p>
-      <w:pPr>
-        <w:spacing w:after="0" w:before="0" w:line="280" w:lineRule="exact"/>
-        <w:ind w:left="0"/>
-      </w:pPr>
-      <w:r>
-        <w:rPr>
-          <w:rFonts w:ascii="Times New Roman" w:hAnsi="Times New Roman"/>
-          <w:b w:val="0"/>
-          <w:i w:val="0"/>
-          <w:sz w:val="20"/>
-        </w:rPr>
-        <w:t xml:space="preserve">13: </w:t>
-      </w:r>
-      <w:r>
-        <w:rPr>
-          <w:rFonts w:ascii="Times New Roman" w:hAnsi="Times New Roman"/>
-          <w:b w:val="0"/>
-          <w:i w:val="0"/>
-          <w:sz w:val="20"/>
-        </w:rPr>
-        <w:t xml:space="preserve">completedResults </w:t>
-      </w:r>
-      <w:r>
-        <w:rPr>
-          <w:rFonts w:ascii="Times New Roman" w:hAnsi="Times New Roman"/>
-          <w:b w:val="0"/>
-          <w:i w:val="0"/>
-          <w:sz w:val="20"/>
-        </w:rPr>
-        <w:t>←</w:t>
-      </w:r>
-      <w:r>
-        <w:rPr>
-          <w:rFonts w:ascii="Times New Roman" w:hAnsi="Times New Roman"/>
-          <w:b w:val="0"/>
-          <w:i w:val="0"/>
-          <w:sz w:val="20"/>
-        </w:rPr>
-        <w:t xml:space="preserve"> </w:t>
-      </w:r>
-      <w:r>
-        <w:rPr>
-          <w:rFonts w:ascii="Times New Roman" w:hAnsi="Times New Roman"/>
-          <w:b w:val="0"/>
-          <w:i w:val="0"/>
-          <w:sz w:val="20"/>
-        </w:rPr>
-        <w:t>∅</w:t>
-      </w:r>
-    </w:p>
-    <w:p>
-      <w:pPr>
-        <w:spacing w:after="0" w:before="0" w:line="280" w:lineRule="exact"/>
-        <w:ind w:left="0"/>
-      </w:pPr>
-      <w:r>
-        <w:rPr>
-          <w:rFonts w:ascii="Times New Roman" w:hAnsi="Times New Roman"/>
-          <w:b w:val="0"/>
-          <w:i w:val="0"/>
-          <w:sz w:val="20"/>
-        </w:rPr>
-        <w:t xml:space="preserve">14: </w:t>
-      </w:r>
-      <w:r>
-        <w:rPr>
-          <w:rFonts w:ascii="Times New Roman" w:hAnsi="Times New Roman"/>
-          <w:b w:val="0"/>
-          <w:i w:val="0"/>
-          <w:sz w:val="20"/>
-        </w:rPr>
-        <w:t xml:space="preserve">active </w:t>
-      </w:r>
-      <w:r>
-        <w:rPr>
-          <w:rFonts w:ascii="Times New Roman" w:hAnsi="Times New Roman"/>
-          <w:b w:val="0"/>
-          <w:i w:val="0"/>
-          <w:sz w:val="20"/>
-        </w:rPr>
-        <w:t>←</w:t>
-      </w:r>
-      <w:r>
-        <w:rPr>
-          <w:rFonts w:ascii="Times New Roman" w:hAnsi="Times New Roman"/>
-          <w:b w:val="0"/>
-          <w:i w:val="0"/>
-          <w:sz w:val="20"/>
-        </w:rPr>
-        <w:t xml:space="preserve"> NextTask(rootTask)</w:t>
-      </w:r>
-    </w:p>
-    <w:p>
-      <w:pPr>
-        <w:spacing w:after="0" w:before="0" w:line="280" w:lineRule="exact"/>
-        <w:ind w:left="0"/>
-      </w:pPr>
-      <w:r>
-        <w:rPr>
-          <w:rFonts w:ascii="Times New Roman" w:hAnsi="Times New Roman"/>
-          <w:b w:val="0"/>
-          <w:i w:val="0"/>
-          <w:sz w:val="20"/>
-        </w:rPr>
-        <w:t xml:space="preserve">15: </w:t>
-      </w:r>
-      <w:r>
-        <w:rPr>
-          <w:rFonts w:ascii="Times New Roman" w:hAnsi="Times New Roman"/>
-          <w:b/>
-          <w:i w:val="0"/>
-          <w:sz w:val="20"/>
-        </w:rPr>
-        <w:t>while</w:t>
-      </w:r>
-      <w:r>
-        <w:rPr>
-          <w:rFonts w:ascii="Times New Roman" w:hAnsi="Times New Roman"/>
-          <w:b w:val="0"/>
-          <w:i w:val="0"/>
-          <w:sz w:val="20"/>
-        </w:rPr>
-        <w:t xml:space="preserve"> active </w:t>
-      </w:r>
-      <w:r>
-        <w:rPr>
-          <w:rFonts w:ascii="Times New Roman" w:hAnsi="Times New Roman"/>
-          <w:b w:val="0"/>
-          <w:i w:val="0"/>
-          <w:sz w:val="20"/>
-        </w:rPr>
-        <w:t>≠</w:t>
-      </w:r>
-      <w:r>
-        <w:rPr>
-          <w:rFonts w:ascii="Times New Roman" w:hAnsi="Times New Roman"/>
-          <w:b w:val="0"/>
-          <w:i w:val="0"/>
-          <w:sz w:val="20"/>
-        </w:rPr>
-        <w:t xml:space="preserve"> NULL </w:t>
-      </w:r>
-      <w:r>
-        <w:rPr>
-          <w:rFonts w:ascii="Times New Roman" w:hAnsi="Times New Roman"/>
-          <w:b/>
-          <w:i w:val="0"/>
-          <w:sz w:val="20"/>
-        </w:rPr>
-        <w:t>do</w:t>
-      </w:r>
-    </w:p>
-    <w:p>
-      <w:pPr>
-        <w:spacing w:after="0" w:before="0" w:line="280" w:lineRule="exact"/>
-        <w:ind w:left="283"/>
-      </w:pPr>
-      <w:r>
-        <w:rPr>
-          <w:rFonts w:ascii="Times New Roman" w:hAnsi="Times New Roman"/>
-          <w:b w:val="0"/>
-          <w:i w:val="0"/>
-          <w:sz w:val="20"/>
-        </w:rPr>
-        <w:t xml:space="preserve">16: </w:t>
-      </w:r>
-      <w:r>
-        <w:rPr>
-          <w:rFonts w:ascii="Times New Roman" w:hAnsi="Times New Roman"/>
-          <w:b w:val="0"/>
-          <w:i w:val="0"/>
-          <w:sz w:val="20"/>
-        </w:rPr>
-        <w:t xml:space="preserve">context </w:t>
-      </w:r>
-      <w:r>
-        <w:rPr>
-          <w:rFonts w:ascii="Times New Roman" w:hAnsi="Times New Roman"/>
-          <w:b w:val="0"/>
-          <w:i w:val="0"/>
-          <w:sz w:val="20"/>
-        </w:rPr>
-        <w:t>←</w:t>
-      </w:r>
-      <w:r>
-        <w:rPr>
-          <w:rFonts w:ascii="Times New Roman" w:hAnsi="Times New Roman"/>
-          <w:b w:val="0"/>
-          <w:i w:val="0"/>
-          <w:sz w:val="20"/>
-        </w:rPr>
-        <w:t xml:space="preserve"> BuildContext(active, completedResults)</w:t>
-      </w:r>
-    </w:p>
-    <w:p>
-      <w:pPr>
-        <w:spacing w:after="0" w:before="0" w:line="280" w:lineRule="exact"/>
-        <w:ind w:left="283"/>
-      </w:pPr>
-      <w:r>
-        <w:rPr>
-          <w:rFonts w:ascii="Times New Roman" w:hAnsi="Times New Roman"/>
-          <w:b w:val="0"/>
-          <w:i w:val="0"/>
-          <w:sz w:val="20"/>
-        </w:rPr>
-        <w:t xml:space="preserve">17: </w:t>
-      </w:r>
-      <w:r>
-        <w:rPr>
-          <w:rFonts w:ascii="Times New Roman" w:hAnsi="Times New Roman"/>
-          <w:b w:val="0"/>
-          <w:i w:val="0"/>
-          <w:sz w:val="20"/>
-        </w:rPr>
-        <w:t xml:space="preserve">result </w:t>
-      </w:r>
-      <w:r>
-        <w:rPr>
-          <w:rFonts w:ascii="Times New Roman" w:hAnsi="Times New Roman"/>
-          <w:b w:val="0"/>
-          <w:i w:val="0"/>
-          <w:sz w:val="20"/>
-        </w:rPr>
-        <w:t>←</w:t>
-      </w:r>
-      <w:r>
-        <w:rPr>
-          <w:rFonts w:ascii="Times New Roman" w:hAnsi="Times New Roman"/>
-          <w:b w:val="0"/>
-          <w:i w:val="0"/>
-          <w:sz w:val="20"/>
-        </w:rPr>
-        <w:t xml:space="preserve"> TaskExecute(active, context)</w:t>
-      </w:r>
-    </w:p>
-    <w:p>
-      <w:pPr>
-        <w:spacing w:after="0" w:before="0" w:line="280" w:lineRule="exact"/>
-        <w:ind w:left="283"/>
-      </w:pPr>
-      <w:r>
-        <w:rPr>
-          <w:rFonts w:ascii="Times New Roman" w:hAnsi="Times New Roman"/>
-          <w:b w:val="0"/>
-          <w:i w:val="0"/>
-          <w:sz w:val="20"/>
-        </w:rPr>
-        <w:t xml:space="preserve">18: </w:t>
-      </w:r>
-      <w:r>
-        <w:rPr>
-          <w:rFonts w:ascii="Times New Roman" w:hAnsi="Times New Roman"/>
-          <w:b w:val="0"/>
-          <w:i w:val="0"/>
-          <w:sz w:val="20"/>
-        </w:rPr>
-        <w:t xml:space="preserve">retries </w:t>
-      </w:r>
-      <w:r>
-        <w:rPr>
-          <w:rFonts w:ascii="Times New Roman" w:hAnsi="Times New Roman"/>
-          <w:b w:val="0"/>
-          <w:i w:val="0"/>
-          <w:sz w:val="20"/>
-        </w:rPr>
-        <w:t>←</w:t>
-      </w:r>
-      <w:r>
-        <w:rPr>
-          <w:rFonts w:ascii="Times New Roman" w:hAnsi="Times New Roman"/>
-          <w:b w:val="0"/>
-          <w:i w:val="0"/>
-          <w:sz w:val="20"/>
-        </w:rPr>
-        <w:t xml:space="preserve"> 0</w:t>
-      </w:r>
-    </w:p>
-    <w:p>
-      <w:pPr>
-        <w:spacing w:after="0" w:before="0" w:line="280" w:lineRule="exact"/>
-        <w:ind w:left="283"/>
-      </w:pPr>
-      <w:r>
-        <w:rPr>
-          <w:rFonts w:ascii="Times New Roman" w:hAnsi="Times New Roman"/>
-          <w:b w:val="0"/>
-          <w:i w:val="0"/>
-          <w:sz w:val="20"/>
-        </w:rPr>
-        <w:t xml:space="preserve">19: </w:t>
-      </w:r>
-      <w:r>
-        <w:rPr>
-          <w:rFonts w:ascii="Times New Roman" w:hAnsi="Times New Roman"/>
-          <w:b w:val="0"/>
-          <w:i w:val="0"/>
-          <w:sz w:val="20"/>
-        </w:rPr>
-        <w:t xml:space="preserve">decision </w:t>
-      </w:r>
-      <w:r>
-        <w:rPr>
-          <w:rFonts w:ascii="Times New Roman" w:hAnsi="Times New Roman"/>
-          <w:b w:val="0"/>
-          <w:i w:val="0"/>
-          <w:sz w:val="20"/>
-        </w:rPr>
-        <w:t>←</w:t>
-      </w:r>
-      <w:r>
-        <w:rPr>
-          <w:rFonts w:ascii="Times New Roman" w:hAnsi="Times New Roman"/>
-          <w:b w:val="0"/>
-          <w:i w:val="0"/>
-          <w:sz w:val="20"/>
-        </w:rPr>
-        <w:t xml:space="preserve"> ResultReview(result)</w:t>
-      </w:r>
-    </w:p>
-    <w:p>
-      <w:pPr>
-        <w:spacing w:after="0" w:before="0" w:line="280" w:lineRule="exact"/>
-        <w:ind w:left="283"/>
-      </w:pPr>
-      <w:r>
-        <w:rPr>
-          <w:rFonts w:ascii="Times New Roman" w:hAnsi="Times New Roman"/>
-          <w:b w:val="0"/>
-          <w:i w:val="0"/>
-          <w:sz w:val="20"/>
-        </w:rPr>
-        <w:t xml:space="preserve">20: </w:t>
-      </w:r>
-      <w:r>
-        <w:rPr>
-          <w:rFonts w:ascii="Times New Roman" w:hAnsi="Times New Roman"/>
-          <w:b/>
-          <w:i w:val="0"/>
-          <w:sz w:val="20"/>
-        </w:rPr>
-        <w:t>while</w:t>
-      </w:r>
-      <w:r>
-        <w:rPr>
-          <w:rFonts w:ascii="Times New Roman" w:hAnsi="Times New Roman"/>
-          <w:b w:val="0"/>
-          <w:i w:val="0"/>
-          <w:sz w:val="20"/>
-        </w:rPr>
-        <w:t xml:space="preserve"> decision = reject </w:t>
-      </w:r>
-      <w:r>
-        <w:rPr>
-          <w:rFonts w:ascii="Times New Roman" w:hAnsi="Times New Roman"/>
-          <w:b w:val="0"/>
-          <w:i w:val="0"/>
-          <w:sz w:val="20"/>
-        </w:rPr>
-        <w:t>∧</w:t>
-      </w:r>
-      <w:r>
-        <w:rPr>
-          <w:rFonts w:ascii="Times New Roman" w:hAnsi="Times New Roman"/>
-          <w:b w:val="0"/>
-          <w:i w:val="0"/>
-          <w:sz w:val="20"/>
-        </w:rPr>
-        <w:t xml:space="preserve"> retries &lt; retryLimit </w:t>
-      </w:r>
-      <w:r>
-        <w:rPr>
-          <w:rFonts w:ascii="Times New Roman" w:hAnsi="Times New Roman"/>
-          <w:b/>
-          <w:i w:val="0"/>
-          <w:sz w:val="20"/>
-        </w:rPr>
-        <w:t>do</w:t>
-      </w:r>
-    </w:p>
-    <w:p>
-      <w:pPr>
-        <w:spacing w:after="0" w:before="0" w:line="280" w:lineRule="exact"/>
-        <w:ind w:left="567"/>
-      </w:pPr>
-      <w:r>
-        <w:rPr>
-          <w:rFonts w:ascii="Times New Roman" w:hAnsi="Times New Roman"/>
-          <w:b w:val="0"/>
-          <w:i w:val="0"/>
-          <w:sz w:val="20"/>
-        </w:rPr>
-        <w:t xml:space="preserve">21: </w:t>
-      </w:r>
-      <w:r>
-        <w:rPr>
-          <w:rFonts w:ascii="Times New Roman" w:hAnsi="Times New Roman"/>
-          <w:b w:val="0"/>
-          <w:i w:val="0"/>
-          <w:sz w:val="20"/>
-        </w:rPr>
-        <w:t xml:space="preserve">result </w:t>
-      </w:r>
-      <w:r>
-        <w:rPr>
-          <w:rFonts w:ascii="Times New Roman" w:hAnsi="Times New Roman"/>
-          <w:b w:val="0"/>
-          <w:i w:val="0"/>
-          <w:sz w:val="20"/>
-        </w:rPr>
-        <w:t>←</w:t>
-      </w:r>
-      <w:r>
-        <w:rPr>
-          <w:rFonts w:ascii="Times New Roman" w:hAnsi="Times New Roman"/>
-          <w:b w:val="0"/>
-          <w:i w:val="0"/>
-          <w:sz w:val="20"/>
-        </w:rPr>
-        <w:t xml:space="preserve"> TaskExecute(active, context)</w:t>
-      </w:r>
-    </w:p>
-    <w:p>
-      <w:pPr>
-        <w:spacing w:after="0" w:before="0" w:line="280" w:lineRule="exact"/>
-        <w:ind w:left="567"/>
-      </w:pPr>
-      <w:r>
-        <w:rPr>
-          <w:rFonts w:ascii="Times New Roman" w:hAnsi="Times New Roman"/>
-          <w:b w:val="0"/>
-          <w:i w:val="0"/>
-          <w:sz w:val="20"/>
-        </w:rPr>
-        <w:t xml:space="preserve">22: </w:t>
-      </w:r>
-      <w:r>
-        <w:rPr>
-          <w:rFonts w:ascii="Times New Roman" w:hAnsi="Times New Roman"/>
-          <w:b w:val="0"/>
-          <w:i w:val="0"/>
-          <w:sz w:val="20"/>
-        </w:rPr>
-        <w:t xml:space="preserve">decision </w:t>
-      </w:r>
-      <w:r>
-        <w:rPr>
-          <w:rFonts w:ascii="Times New Roman" w:hAnsi="Times New Roman"/>
-          <w:b w:val="0"/>
-          <w:i w:val="0"/>
-          <w:sz w:val="20"/>
-        </w:rPr>
-        <w:t>←</w:t>
-      </w:r>
-      <w:r>
-        <w:rPr>
-          <w:rFonts w:ascii="Times New Roman" w:hAnsi="Times New Roman"/>
-          <w:b w:val="0"/>
-          <w:i w:val="0"/>
-          <w:sz w:val="20"/>
-        </w:rPr>
-        <w:t xml:space="preserve"> ResultReview(result);   retries </w:t>
-      </w:r>
-      <w:r>
-        <w:rPr>
-          <w:rFonts w:ascii="Times New Roman" w:hAnsi="Times New Roman"/>
-          <w:b w:val="0"/>
-          <w:i w:val="0"/>
-          <w:sz w:val="20"/>
-        </w:rPr>
-        <w:t>←</w:t>
-      </w:r>
-      <w:r>
-        <w:rPr>
-          <w:rFonts w:ascii="Times New Roman" w:hAnsi="Times New Roman"/>
-          <w:b w:val="0"/>
-          <w:i w:val="0"/>
-          <w:sz w:val="20"/>
-        </w:rPr>
-        <w:t xml:space="preserve"> retries + 1</w:t>
-      </w:r>
-    </w:p>
-    <w:p>
-      <w:pPr>
-        <w:spacing w:after="0" w:before="0" w:line="280" w:lineRule="exact"/>
-        <w:ind w:left="283"/>
-      </w:pPr>
-      <w:r>
-        <w:rPr>
-          <w:rFonts w:ascii="Times New Roman" w:hAnsi="Times New Roman"/>
-          <w:b w:val="0"/>
-          <w:i w:val="0"/>
-          <w:sz w:val="20"/>
-        </w:rPr>
-        <w:t xml:space="preserve">23: </w:t>
-      </w:r>
-      <w:r>
-        <w:rPr>
-          <w:rFonts w:ascii="Times New Roman" w:hAnsi="Times New Roman"/>
-          <w:b/>
-          <w:i w:val="0"/>
-          <w:sz w:val="20"/>
-        </w:rPr>
-        <w:t>end</w:t>
-      </w:r>
-      <w:r>
-        <w:rPr>
-          <w:rFonts w:ascii="Times New Roman" w:hAnsi="Times New Roman"/>
-          <w:b w:val="0"/>
-          <w:i w:val="0"/>
-          <w:sz w:val="20"/>
-        </w:rPr>
-        <w:t xml:space="preserve"> </w:t>
-      </w:r>
-      <w:r>
-        <w:rPr>
-          <w:rFonts w:ascii="Times New Roman" w:hAnsi="Times New Roman"/>
-          <w:b/>
-          <w:i w:val="0"/>
-          <w:sz w:val="20"/>
-        </w:rPr>
-        <w:t>while</w:t>
-      </w:r>
-    </w:p>
-    <w:p>
-      <w:pPr>
-        <w:spacing w:after="0" w:before="0" w:line="280" w:lineRule="exact"/>
-        <w:ind w:left="283"/>
-      </w:pPr>
-      <w:r>
-        <w:rPr>
-          <w:rFonts w:ascii="Times New Roman" w:hAnsi="Times New Roman"/>
-          <w:b w:val="0"/>
-          <w:i w:val="0"/>
-          <w:sz w:val="20"/>
-        </w:rPr>
-        <w:t xml:space="preserve">24: </w:t>
-      </w:r>
-      <w:r>
-        <w:rPr>
-          <w:rFonts w:ascii="Times New Roman" w:hAnsi="Times New Roman"/>
-          <w:b/>
-          <w:i w:val="0"/>
-          <w:sz w:val="20"/>
-        </w:rPr>
-        <w:t>if</w:t>
-      </w:r>
-      <w:r>
-        <w:rPr>
-          <w:rFonts w:ascii="Times New Roman" w:hAnsi="Times New Roman"/>
-          <w:b w:val="0"/>
-          <w:i w:val="0"/>
-          <w:sz w:val="20"/>
-        </w:rPr>
-        <w:t xml:space="preserve"> decision = replan </w:t>
-      </w:r>
-      <w:r>
-        <w:rPr>
-          <w:rFonts w:ascii="Times New Roman" w:hAnsi="Times New Roman"/>
-          <w:b/>
-          <w:i w:val="0"/>
-          <w:sz w:val="20"/>
-        </w:rPr>
-        <w:t>then</w:t>
-      </w:r>
-    </w:p>
-    <w:p>
-      <w:pPr>
-        <w:spacing w:after="0" w:before="0" w:line="280" w:lineRule="exact"/>
-        <w:ind w:left="567"/>
-      </w:pPr>
-      <w:r>
-        <w:rPr>
-          <w:rFonts w:ascii="Times New Roman" w:hAnsi="Times New Roman"/>
-          <w:b w:val="0"/>
-          <w:i w:val="0"/>
-          <w:sz w:val="20"/>
-        </w:rPr>
-        <w:t xml:space="preserve">25: </w:t>
-      </w:r>
-      <w:r>
-        <w:rPr>
-          <w:rFonts w:ascii="Times New Roman" w:hAnsi="Times New Roman"/>
-          <w:b w:val="0"/>
-          <w:i w:val="0"/>
-          <w:sz w:val="20"/>
-        </w:rPr>
-        <w:t>TaskAssess(active)</w:t>
-      </w:r>
-    </w:p>
-    <w:p>
-      <w:pPr>
-        <w:spacing w:after="0" w:before="0" w:line="280" w:lineRule="exact"/>
-        <w:ind w:left="567"/>
-      </w:pPr>
-      <w:r>
-        <w:rPr>
-          <w:rFonts w:ascii="Times New Roman" w:hAnsi="Times New Roman"/>
-          <w:b w:val="0"/>
-          <w:i w:val="0"/>
-          <w:sz w:val="20"/>
-        </w:rPr>
-        <w:t xml:space="preserve">26: </w:t>
-      </w:r>
-      <w:r>
-        <w:rPr>
-          <w:rFonts w:ascii="Times New Roman" w:hAnsi="Times New Roman"/>
-          <w:b w:val="0"/>
-          <w:i w:val="0"/>
-          <w:sz w:val="20"/>
-        </w:rPr>
-        <w:t>TaskAnalyze(active, local_replan)</w:t>
-      </w:r>
-    </w:p>
-    <w:p>
-      <w:pPr>
-        <w:spacing w:after="0" w:before="0" w:line="280" w:lineRule="exact"/>
-        <w:ind w:left="567"/>
-      </w:pPr>
-      <w:r>
-        <w:rPr>
-          <w:rFonts w:ascii="Times New Roman" w:hAnsi="Times New Roman"/>
-          <w:b w:val="0"/>
-          <w:i w:val="0"/>
-          <w:sz w:val="20"/>
-        </w:rPr>
-        <w:t xml:space="preserve">27: </w:t>
-      </w:r>
-      <w:r>
-        <w:rPr>
-          <w:rFonts w:ascii="Times New Roman" w:hAnsi="Times New Roman"/>
-          <w:b w:val="0"/>
-          <w:i w:val="0"/>
-          <w:sz w:val="20"/>
-        </w:rPr>
-        <w:t xml:space="preserve">result </w:t>
-      </w:r>
-      <w:r>
-        <w:rPr>
-          <w:rFonts w:ascii="Times New Roman" w:hAnsi="Times New Roman"/>
-          <w:b w:val="0"/>
-          <w:i w:val="0"/>
-          <w:sz w:val="20"/>
-        </w:rPr>
-        <w:t>←</w:t>
-      </w:r>
-      <w:r>
-        <w:rPr>
-          <w:rFonts w:ascii="Times New Roman" w:hAnsi="Times New Roman"/>
-          <w:b w:val="0"/>
-          <w:i w:val="0"/>
-          <w:sz w:val="20"/>
-        </w:rPr>
-        <w:t xml:space="preserve"> TaskExecute(active, context)</w:t>
-      </w:r>
-    </w:p>
-    <w:p>
-      <w:pPr>
-        <w:spacing w:after="0" w:before="0" w:line="280" w:lineRule="exact"/>
-        <w:ind w:left="567"/>
-      </w:pPr>
-      <w:r>
-        <w:rPr>
-          <w:rFonts w:ascii="Times New Roman" w:hAnsi="Times New Roman"/>
-          <w:b w:val="0"/>
-          <w:i w:val="0"/>
-          <w:sz w:val="20"/>
-        </w:rPr>
-        <w:t xml:space="preserve">28: </w:t>
-      </w:r>
-      <w:r>
-        <w:rPr>
-          <w:rFonts w:ascii="Times New Roman" w:hAnsi="Times New Roman"/>
-          <w:b w:val="0"/>
-          <w:i w:val="0"/>
-          <w:sz w:val="20"/>
-        </w:rPr>
-        <w:t xml:space="preserve">decision </w:t>
-      </w:r>
-      <w:r>
-        <w:rPr>
-          <w:rFonts w:ascii="Times New Roman" w:hAnsi="Times New Roman"/>
-          <w:b w:val="0"/>
-          <w:i w:val="0"/>
-          <w:sz w:val="20"/>
-        </w:rPr>
-        <w:t>←</w:t>
-      </w:r>
-      <w:r>
-        <w:rPr>
-          <w:rFonts w:ascii="Times New Roman" w:hAnsi="Times New Roman"/>
-          <w:b w:val="0"/>
-          <w:i w:val="0"/>
-          <w:sz w:val="20"/>
-        </w:rPr>
-        <w:t xml:space="preserve"> ResultReview(result)</w:t>
-      </w:r>
-    </w:p>
-    <w:p>
-      <w:pPr>
-        <w:spacing w:after="0" w:before="0" w:line="280" w:lineRule="exact"/>
-        <w:ind w:left="283"/>
-      </w:pPr>
-      <w:r>
-        <w:rPr>
-          <w:rFonts w:ascii="Times New Roman" w:hAnsi="Times New Roman"/>
-          <w:b w:val="0"/>
-          <w:i w:val="0"/>
-          <w:sz w:val="20"/>
-        </w:rPr>
-        <w:t xml:space="preserve">29: </w:t>
-      </w:r>
-      <w:r>
-        <w:rPr>
-          <w:rFonts w:ascii="Times New Roman" w:hAnsi="Times New Roman"/>
-          <w:b/>
-          <w:i w:val="0"/>
-          <w:sz w:val="20"/>
-        </w:rPr>
-        <w:t>end</w:t>
-      </w:r>
-      <w:r>
-        <w:rPr>
-          <w:rFonts w:ascii="Times New Roman" w:hAnsi="Times New Roman"/>
-          <w:b w:val="0"/>
-          <w:i w:val="0"/>
-          <w:sz w:val="20"/>
-        </w:rPr>
-        <w:t xml:space="preserve"> </w:t>
-      </w:r>
-      <w:r>
-        <w:rPr>
-          <w:rFonts w:ascii="Times New Roman" w:hAnsi="Times New Roman"/>
-          <w:b/>
-          <w:i w:val="0"/>
-          <w:sz w:val="20"/>
-        </w:rPr>
-        <w:t>if</w:t>
-      </w:r>
-    </w:p>
-    <w:p>
-      <w:pPr>
-        <w:spacing w:after="0" w:before="0" w:line="280" w:lineRule="exact"/>
-        <w:ind w:left="283"/>
-      </w:pPr>
-      <w:r>
-        <w:rPr>
-          <w:rFonts w:ascii="Times New Roman" w:hAnsi="Times New Roman"/>
-          <w:b w:val="0"/>
-          <w:i w:val="0"/>
-          <w:sz w:val="20"/>
-        </w:rPr>
-        <w:t xml:space="preserve">30: </w:t>
-      </w:r>
-      <w:r>
-        <w:rPr>
-          <w:rFonts w:ascii="Times New Roman" w:hAnsi="Times New Roman"/>
-          <w:b w:val="0"/>
-          <w:i w:val="0"/>
-          <w:sz w:val="20"/>
-        </w:rPr>
-        <w:t xml:space="preserve">completedResults </w:t>
-      </w:r>
-      <w:r>
-        <w:rPr>
-          <w:rFonts w:ascii="Times New Roman" w:hAnsi="Times New Roman"/>
-          <w:b w:val="0"/>
-          <w:i w:val="0"/>
-          <w:sz w:val="20"/>
-        </w:rPr>
-        <w:t>←</w:t>
-      </w:r>
-      <w:r>
-        <w:rPr>
-          <w:rFonts w:ascii="Times New Roman" w:hAnsi="Times New Roman"/>
-          <w:b w:val="0"/>
-          <w:i w:val="0"/>
-          <w:sz w:val="20"/>
-        </w:rPr>
-        <w:t xml:space="preserve"> completedResults </w:t>
-      </w:r>
-      <w:r>
-        <w:rPr>
-          <w:rFonts w:ascii="Times New Roman" w:hAnsi="Times New Roman"/>
-          <w:b w:val="0"/>
-          <w:i w:val="0"/>
-          <w:sz w:val="20"/>
-        </w:rPr>
-        <w:t>∪</w:t>
-      </w:r>
-      <w:r>
-        <w:rPr>
-          <w:rFonts w:ascii="Times New Roman" w:hAnsi="Times New Roman"/>
-          <w:b w:val="0"/>
-          <w:i w:val="0"/>
-          <w:sz w:val="20"/>
-        </w:rPr>
-        <w:t xml:space="preserve"> {result}</w:t>
-      </w:r>
-    </w:p>
-    <w:p>
-      <w:pPr>
-        <w:spacing w:after="0" w:before="0" w:line="280" w:lineRule="exact"/>
-        <w:ind w:left="283"/>
-      </w:pPr>
-      <w:r>
-        <w:rPr>
-          <w:rFonts w:ascii="Times New Roman" w:hAnsi="Times New Roman"/>
-          <w:b w:val="0"/>
-          <w:i w:val="0"/>
-          <w:sz w:val="20"/>
-        </w:rPr>
-        <w:t xml:space="preserve">31: </w:t>
-      </w:r>
-      <w:r>
-        <w:rPr>
-          <w:rFonts w:ascii="Times New Roman" w:hAnsi="Times New Roman"/>
-          <w:b w:val="0"/>
-          <w:i w:val="0"/>
-          <w:sz w:val="20"/>
-        </w:rPr>
-        <w:t xml:space="preserve">active </w:t>
-      </w:r>
-      <w:r>
-        <w:rPr>
-          <w:rFonts w:ascii="Times New Roman" w:hAnsi="Times New Roman"/>
-          <w:b w:val="0"/>
-          <w:i w:val="0"/>
-          <w:sz w:val="20"/>
-        </w:rPr>
-        <w:t>←</w:t>
-      </w:r>
-      <w:r>
-        <w:rPr>
-          <w:rFonts w:ascii="Times New Roman" w:hAnsi="Times New Roman"/>
-          <w:b w:val="0"/>
-          <w:i w:val="0"/>
-          <w:sz w:val="20"/>
-        </w:rPr>
-        <w:t xml:space="preserve"> NextTask(rootTask)</w:t>
-      </w:r>
-    </w:p>
-    <w:p>
-      <w:pPr>
-        <w:spacing w:after="0" w:before="0" w:line="280" w:lineRule="exact"/>
-        <w:ind w:left="0"/>
-      </w:pPr>
-      <w:r>
-        <w:rPr>
-          <w:rFonts w:ascii="Times New Roman" w:hAnsi="Times New Roman"/>
-          <w:b w:val="0"/>
-          <w:i w:val="0"/>
-          <w:sz w:val="20"/>
-        </w:rPr>
-        <w:t xml:space="preserve">32: </w:t>
-      </w:r>
-      <w:r>
-        <w:rPr>
-          <w:rFonts w:ascii="Times New Roman" w:hAnsi="Times New Roman"/>
-          <w:b/>
-          <w:i w:val="0"/>
-          <w:sz w:val="20"/>
-        </w:rPr>
-        <w:t>end</w:t>
-      </w:r>
-      <w:r>
-        <w:rPr>
-          <w:rFonts w:ascii="Times New Roman" w:hAnsi="Times New Roman"/>
-          <w:b w:val="0"/>
-          <w:i w:val="0"/>
-          <w:sz w:val="20"/>
-        </w:rPr>
-        <w:t xml:space="preserve"> </w:t>
-      </w:r>
-      <w:r>
-        <w:rPr>
-          <w:rFonts w:ascii="Times New Roman" w:hAnsi="Times New Roman"/>
-          <w:b/>
-          <w:i w:val="0"/>
-          <w:sz w:val="20"/>
-        </w:rPr>
-        <w:t>while</w:t>
-      </w:r>
-    </w:p>
-    <w:p>
-      <w:pPr>
-        <w:spacing w:after="0" w:before="0" w:line="240" w:lineRule="exact"/>
-      </w:pPr>
-    </w:p>
-    <w:p>
-      <w:pPr>
-        <w:spacing w:after="0" w:before="0" w:line="280" w:lineRule="exact"/>
-        <w:ind w:left="0"/>
-      </w:pPr>
-      <w:r>
-        <w:rPr>
-          <w:rFonts w:ascii="Times New Roman" w:hAnsi="Times New Roman"/>
-          <w:b w:val="0"/>
-          <w:i w:val="0"/>
-          <w:sz w:val="20"/>
-        </w:rPr>
-        <w:t>// Step 5: Aggregate Results</w:t>
-      </w:r>
-    </w:p>
-    <w:p>
-      <w:pPr>
-        <w:spacing w:after="0" w:before="0" w:line="280" w:lineRule="exact"/>
-        <w:ind w:left="0"/>
-      </w:pPr>
-      <w:r>
-        <w:rPr>
-          <w:rFonts w:ascii="Times New Roman" w:hAnsi="Times New Roman"/>
-          <w:b w:val="0"/>
-          <w:i w:val="0"/>
-          <w:sz w:val="20"/>
-        </w:rPr>
-        <w:t xml:space="preserve">33: </w:t>
-      </w:r>
-      <w:r>
-        <w:rPr>
-          <w:rFonts w:ascii="Times New Roman" w:hAnsi="Times New Roman"/>
-          <w:b w:val="0"/>
-          <w:i w:val="0"/>
-          <w:sz w:val="20"/>
-        </w:rPr>
-        <w:t xml:space="preserve">aggregatedResult </w:t>
-      </w:r>
-      <w:r>
-        <w:rPr>
-          <w:rFonts w:ascii="Times New Roman" w:hAnsi="Times New Roman"/>
-          <w:b w:val="0"/>
-          <w:i w:val="0"/>
-          <w:sz w:val="20"/>
-        </w:rPr>
-        <w:t>←</w:t>
-      </w:r>
-      <w:r>
-        <w:rPr>
-          <w:rFonts w:ascii="Times New Roman" w:hAnsi="Times New Roman"/>
-          <w:b w:val="0"/>
-          <w:i w:val="0"/>
-          <w:sz w:val="20"/>
-        </w:rPr>
-        <w:t xml:space="preserve"> Aggregate(rootTask)</w:t>
-      </w:r>
-    </w:p>
+    <w:tbl>
+      <w:tblPr>
+        <w:tblW w:type="auto" w:w="0"/>
+        <w:jc w:val="center"/>
+        <w:tblLook w:firstColumn="1" w:firstRow="1" w:lastColumn="0" w:lastRow="0" w:noHBand="0" w:noVBand="1" w:val="04A0"/>
+        <w:tblBorders>
+          <w:top w:val="none" w:sz="0" w:space="0" w:color="auto"/>
+          <w:left w:val="none" w:sz="0" w:space="0" w:color="auto"/>
+          <w:bottom w:val="none" w:sz="0" w:space="0" w:color="auto"/>
+          <w:right w:val="none" w:sz="0" w:space="0" w:color="auto"/>
+          <w:insideH w:val="none" w:sz="0" w:space="0" w:color="auto"/>
+          <w:insideV w:val="none" w:sz="0" w:space="0" w:color="auto"/>
+        </w:tblBorders>
+      </w:tblPr>
+      <w:tblGrid>
+        <w:gridCol w:w="4703"/>
+        <w:gridCol w:w="4703"/>
+      </w:tblGrid>
+      <w:tr>
+        <w:trPr>
+          <w:trHeight w:val="160" w:hRule="atLeast"/>
+        </w:trPr>
+        <w:tc>
+          <w:tcPr>
+            <w:tcW w:type="dxa" w:w="680"/>
+            <w:tcBorders>
+              <w:top w:val="none" w:sz="0" w:space="0" w:color="auto"/>
+              <w:left w:val="none" w:sz="0" w:space="0" w:color="auto"/>
+              <w:bottom w:val="none" w:sz="0" w:space="0" w:color="auto"/>
+              <w:right w:val="none" w:sz="0" w:space="0" w:color="auto"/>
+            </w:tcBorders>
+            <w:vAlign w:val="center"/>
+          </w:tcPr>
+          <w:p/>
+        </w:tc>
+        <w:tc>
+          <w:tcPr>
+            <w:tcW w:type="dxa" w:w="7938"/>
+            <w:tcBorders>
+              <w:top w:val="none" w:sz="0" w:space="0" w:color="auto"/>
+              <w:left w:val="none" w:sz="0" w:space="0" w:color="auto"/>
+              <w:bottom w:val="none" w:sz="0" w:space="0" w:color="auto"/>
+              <w:right w:val="none" w:sz="0" w:space="0" w:color="auto"/>
+            </w:tcBorders>
+            <w:vAlign w:val="center"/>
+          </w:tcPr>
+          <w:p>
+            <w:pPr>
+              <w:spacing w:after="0" w:before="0" w:line="260" w:lineRule="exact"/>
+            </w:pPr>
+            <w:r>
+              <w:rPr>
+                <w:rFonts w:ascii="Times New Roman" w:hAnsi="Times New Roman"/>
+                <w:b w:val="0"/>
+                <w:color w:val="808080"/>
+                <w:sz w:val="20"/>
+              </w:rPr>
+              <w:t>// Step 1: Task Creation</w:t>
+            </w:r>
+          </w:p>
+        </w:tc>
+      </w:tr>
+      <w:tr>
+        <w:trPr>
+          <w:trHeight w:val="280" w:hRule="atLeast"/>
+        </w:trPr>
+        <w:tc>
+          <w:tcPr>
+            <w:tcW w:type="dxa" w:w="680"/>
+            <w:tcBorders>
+              <w:top w:val="none" w:sz="0" w:space="0" w:color="auto"/>
+              <w:left w:val="none" w:sz="0" w:space="0" w:color="auto"/>
+              <w:bottom w:val="none" w:sz="0" w:space="0" w:color="auto"/>
+              <w:right w:val="none" w:sz="0" w:space="0" w:color="auto"/>
+            </w:tcBorders>
+            <w:vAlign w:val="center"/>
+          </w:tcPr>
+          <w:p>
+            <w:pPr>
+              <w:spacing w:after="0" w:before="0" w:line="260" w:lineRule="exact"/>
+              <w:jc w:val="right"/>
+            </w:pPr>
+            <w:r>
+              <w:rPr>
+                <w:rFonts w:ascii="Times New Roman" w:hAnsi="Times New Roman"/>
+                <w:sz w:val="20"/>
+              </w:rPr>
+              <w:t>1:</w:t>
+            </w:r>
+          </w:p>
+        </w:tc>
+        <w:tc>
+          <w:tcPr>
+            <w:tcW w:type="dxa" w:w="7938"/>
+            <w:tcBorders>
+              <w:top w:val="none" w:sz="0" w:space="0" w:color="auto"/>
+              <w:left w:val="none" w:sz="0" w:space="0" w:color="auto"/>
+              <w:bottom w:val="none" w:sz="0" w:space="0" w:color="auto"/>
+              <w:right w:val="none" w:sz="0" w:space="0" w:color="auto"/>
+            </w:tcBorders>
+            <w:vAlign w:val="center"/>
+          </w:tcPr>
+          <w:p>
+            <w:pPr>
+              <w:spacing w:after="0" w:before="0" w:line="260" w:lineRule="exact"/>
+            </w:pPr>
+            <w:r>
+              <w:rPr>
+                <w:rFonts w:ascii="Times New Roman" w:hAnsi="Times New Roman"/>
+                <w:b/>
+                <w:i w:val="0"/>
+                <w:sz w:val="20"/>
+              </w:rPr>
+              <w:t>if</w:t>
+            </w:r>
+            <w:r>
+              <w:rPr>
+                <w:rFonts w:ascii="Times New Roman" w:hAnsi="Times New Roman"/>
+                <w:b w:val="0"/>
+                <w:i w:val="0"/>
+                <w:sz w:val="20"/>
+              </w:rPr>
+              <w:t xml:space="preserve"> route = task_creation </w:t>
+            </w:r>
+            <w:r>
+              <w:rPr>
+                <w:rFonts w:ascii="Times New Roman" w:hAnsi="Times New Roman"/>
+                <w:b/>
+                <w:i w:val="0"/>
+                <w:sz w:val="20"/>
+              </w:rPr>
+              <w:t>then</w:t>
+            </w:r>
+          </w:p>
+        </w:tc>
+      </w:tr>
+      <w:tr>
+        <w:trPr>
+          <w:trHeight w:val="280" w:hRule="atLeast"/>
+        </w:trPr>
+        <w:tc>
+          <w:tcPr>
+            <w:tcW w:type="dxa" w:w="680"/>
+            <w:tcBorders>
+              <w:top w:val="none" w:sz="0" w:space="0" w:color="auto"/>
+              <w:left w:val="none" w:sz="0" w:space="0" w:color="auto"/>
+              <w:bottom w:val="none" w:sz="0" w:space="0" w:color="auto"/>
+              <w:right w:val="none" w:sz="0" w:space="0" w:color="auto"/>
+            </w:tcBorders>
+            <w:vAlign w:val="center"/>
+          </w:tcPr>
+          <w:p>
+            <w:pPr>
+              <w:spacing w:after="0" w:before="0" w:line="260" w:lineRule="exact"/>
+              <w:jc w:val="right"/>
+            </w:pPr>
+            <w:r>
+              <w:rPr>
+                <w:rFonts w:ascii="Times New Roman" w:hAnsi="Times New Roman"/>
+                <w:sz w:val="20"/>
+              </w:rPr>
+              <w:t>2:</w:t>
+            </w:r>
+          </w:p>
+        </w:tc>
+        <w:tc>
+          <w:tcPr>
+            <w:tcW w:type="dxa" w:w="7938"/>
+            <w:tcBorders>
+              <w:top w:val="none" w:sz="0" w:space="0" w:color="auto"/>
+              <w:left w:val="none" w:sz="0" w:space="0" w:color="auto"/>
+              <w:bottom w:val="none" w:sz="0" w:space="0" w:color="auto"/>
+              <w:right w:val="none" w:sz="0" w:space="0" w:color="auto"/>
+            </w:tcBorders>
+            <w:vAlign w:val="center"/>
+          </w:tcPr>
+          <w:p>
+            <w:pPr>
+              <w:spacing w:after="0" w:before="0" w:line="260" w:lineRule="exact"/>
+              <w:ind w:left="283"/>
+            </w:pPr>
+            <w:r>
+              <w:rPr>
+                <w:rFonts w:ascii="Times New Roman" w:hAnsi="Times New Roman"/>
+                <w:b w:val="0"/>
+                <w:i w:val="0"/>
+                <w:sz w:val="20"/>
+              </w:rPr>
+              <w:t xml:space="preserve">rootTask, summary </w:t>
+            </w:r>
+            <w:r>
+              <w:rPr>
+                <w:rFonts w:ascii="Times New Roman" w:hAnsi="Times New Roman"/>
+                <w:b w:val="0"/>
+                <w:i w:val="0"/>
+                <w:sz w:val="20"/>
+              </w:rPr>
+              <w:t>←</w:t>
+            </w:r>
+            <w:r>
+              <w:rPr>
+                <w:rFonts w:ascii="Times New Roman" w:hAnsi="Times New Roman"/>
+                <w:b w:val="0"/>
+                <w:i w:val="0"/>
+                <w:sz w:val="20"/>
+              </w:rPr>
+              <w:t xml:space="preserve"> TaskCreate(query)</w:t>
+            </w:r>
+          </w:p>
+        </w:tc>
+      </w:tr>
+      <w:tr>
+        <w:trPr>
+          <w:trHeight w:val="280" w:hRule="atLeast"/>
+        </w:trPr>
+        <w:tc>
+          <w:tcPr>
+            <w:tcW w:type="dxa" w:w="680"/>
+            <w:tcBorders>
+              <w:top w:val="none" w:sz="0" w:space="0" w:color="auto"/>
+              <w:left w:val="none" w:sz="0" w:space="0" w:color="auto"/>
+              <w:bottom w:val="none" w:sz="0" w:space="0" w:color="auto"/>
+              <w:right w:val="none" w:sz="0" w:space="0" w:color="auto"/>
+            </w:tcBorders>
+            <w:vAlign w:val="center"/>
+          </w:tcPr>
+          <w:p>
+            <w:pPr>
+              <w:spacing w:after="0" w:before="0" w:line="260" w:lineRule="exact"/>
+              <w:jc w:val="right"/>
+            </w:pPr>
+            <w:r>
+              <w:rPr>
+                <w:rFonts w:ascii="Times New Roman" w:hAnsi="Times New Roman"/>
+                <w:sz w:val="20"/>
+              </w:rPr>
+              <w:t>3:</w:t>
+            </w:r>
+          </w:p>
+        </w:tc>
+        <w:tc>
+          <w:tcPr>
+            <w:tcW w:type="dxa" w:w="7938"/>
+            <w:tcBorders>
+              <w:top w:val="none" w:sz="0" w:space="0" w:color="auto"/>
+              <w:left w:val="none" w:sz="0" w:space="0" w:color="auto"/>
+              <w:bottom w:val="none" w:sz="0" w:space="0" w:color="auto"/>
+              <w:right w:val="none" w:sz="0" w:space="0" w:color="auto"/>
+            </w:tcBorders>
+            <w:vAlign w:val="center"/>
+          </w:tcPr>
+          <w:p>
+            <w:pPr>
+              <w:spacing w:after="0" w:before="0" w:line="260" w:lineRule="exact"/>
+            </w:pPr>
+            <w:r>
+              <w:rPr>
+                <w:rFonts w:ascii="Times New Roman" w:hAnsi="Times New Roman"/>
+                <w:b/>
+                <w:i w:val="0"/>
+                <w:sz w:val="20"/>
+              </w:rPr>
+              <w:t>end</w:t>
+            </w:r>
+            <w:r>
+              <w:rPr>
+                <w:rFonts w:ascii="Times New Roman" w:hAnsi="Times New Roman"/>
+                <w:b w:val="0"/>
+                <w:i w:val="0"/>
+                <w:sz w:val="20"/>
+              </w:rPr>
+              <w:t xml:space="preserve"> </w:t>
+            </w:r>
+            <w:r>
+              <w:rPr>
+                <w:rFonts w:ascii="Times New Roman" w:hAnsi="Times New Roman"/>
+                <w:b/>
+                <w:i w:val="0"/>
+                <w:sz w:val="20"/>
+              </w:rPr>
+              <w:t>if</w:t>
+            </w:r>
+          </w:p>
+        </w:tc>
+      </w:tr>
+      <w:tr>
+        <w:trPr>
+          <w:trHeight w:val="160" w:hRule="atLeast"/>
+        </w:trPr>
+        <w:tc>
+          <w:tcPr>
+            <w:tcW w:type="dxa" w:w="680"/>
+            <w:tcBorders>
+              <w:top w:val="none" w:sz="0" w:space="0" w:color="auto"/>
+              <w:left w:val="none" w:sz="0" w:space="0" w:color="auto"/>
+              <w:bottom w:val="none" w:sz="0" w:space="0" w:color="auto"/>
+              <w:right w:val="none" w:sz="0" w:space="0" w:color="auto"/>
+            </w:tcBorders>
+            <w:vAlign w:val="center"/>
+          </w:tcPr>
+          <w:p/>
+        </w:tc>
+        <w:tc>
+          <w:tcPr>
+            <w:tcW w:type="dxa" w:w="7938"/>
+            <w:tcBorders>
+              <w:top w:val="none" w:sz="0" w:space="0" w:color="auto"/>
+              <w:left w:val="none" w:sz="0" w:space="0" w:color="auto"/>
+              <w:bottom w:val="none" w:sz="0" w:space="0" w:color="auto"/>
+              <w:right w:val="none" w:sz="0" w:space="0" w:color="auto"/>
+            </w:tcBorders>
+            <w:vAlign w:val="center"/>
+          </w:tcPr>
+          <w:p>
+            <w:pPr>
+              <w:spacing w:after="0" w:before="0" w:line="260" w:lineRule="exact"/>
+            </w:pPr>
+            <w:r>
+              <w:rPr>
+                <w:rFonts w:ascii="Times New Roman" w:hAnsi="Times New Roman"/>
+                <w:b w:val="0"/>
+                <w:color w:val="808080"/>
+                <w:sz w:val="20"/>
+              </w:rPr>
+              <w:t>// Step 2: Initial Decomposition</w:t>
+            </w:r>
+          </w:p>
+        </w:tc>
+      </w:tr>
+      <w:tr>
+        <w:trPr>
+          <w:trHeight w:val="280" w:hRule="atLeast"/>
+        </w:trPr>
+        <w:tc>
+          <w:tcPr>
+            <w:tcW w:type="dxa" w:w="680"/>
+            <w:tcBorders>
+              <w:top w:val="none" w:sz="0" w:space="0" w:color="auto"/>
+              <w:left w:val="none" w:sz="0" w:space="0" w:color="auto"/>
+              <w:bottom w:val="none" w:sz="0" w:space="0" w:color="auto"/>
+              <w:right w:val="none" w:sz="0" w:space="0" w:color="auto"/>
+            </w:tcBorders>
+            <w:vAlign w:val="center"/>
+          </w:tcPr>
+          <w:p>
+            <w:pPr>
+              <w:spacing w:after="0" w:before="0" w:line="260" w:lineRule="exact"/>
+              <w:jc w:val="right"/>
+            </w:pPr>
+            <w:r>
+              <w:rPr>
+                <w:rFonts w:ascii="Times New Roman" w:hAnsi="Times New Roman"/>
+                <w:sz w:val="20"/>
+              </w:rPr>
+              <w:t>4:</w:t>
+            </w:r>
+          </w:p>
+        </w:tc>
+        <w:tc>
+          <w:tcPr>
+            <w:tcW w:type="dxa" w:w="7938"/>
+            <w:tcBorders>
+              <w:top w:val="none" w:sz="0" w:space="0" w:color="auto"/>
+              <w:left w:val="none" w:sz="0" w:space="0" w:color="auto"/>
+              <w:bottom w:val="none" w:sz="0" w:space="0" w:color="auto"/>
+              <w:right w:val="none" w:sz="0" w:space="0" w:color="auto"/>
+            </w:tcBorders>
+            <w:vAlign w:val="center"/>
+          </w:tcPr>
+          <w:p>
+            <w:pPr>
+              <w:spacing w:after="0" w:before="0" w:line="260" w:lineRule="exact"/>
+            </w:pPr>
+            <w:r>
+              <w:rPr>
+                <w:rFonts w:ascii="Times New Roman" w:hAnsi="Times New Roman"/>
+                <w:b w:val="0"/>
+                <w:i w:val="0"/>
+                <w:sz w:val="20"/>
+              </w:rPr>
+              <w:t>TaskAnalyze(rootTask, initial_analysis)</w:t>
+            </w:r>
+          </w:p>
+        </w:tc>
+      </w:tr>
+      <w:tr>
+        <w:trPr>
+          <w:trHeight w:val="160" w:hRule="atLeast"/>
+        </w:trPr>
+        <w:tc>
+          <w:tcPr>
+            <w:tcW w:type="dxa" w:w="680"/>
+            <w:tcBorders>
+              <w:top w:val="none" w:sz="0" w:space="0" w:color="auto"/>
+              <w:left w:val="none" w:sz="0" w:space="0" w:color="auto"/>
+              <w:bottom w:val="none" w:sz="0" w:space="0" w:color="auto"/>
+              <w:right w:val="none" w:sz="0" w:space="0" w:color="auto"/>
+            </w:tcBorders>
+            <w:vAlign w:val="center"/>
+          </w:tcPr>
+          <w:p/>
+        </w:tc>
+        <w:tc>
+          <w:tcPr>
+            <w:tcW w:type="dxa" w:w="7938"/>
+            <w:tcBorders>
+              <w:top w:val="none" w:sz="0" w:space="0" w:color="auto"/>
+              <w:left w:val="none" w:sz="0" w:space="0" w:color="auto"/>
+              <w:bottom w:val="none" w:sz="0" w:space="0" w:color="auto"/>
+              <w:right w:val="none" w:sz="0" w:space="0" w:color="auto"/>
+            </w:tcBorders>
+            <w:vAlign w:val="center"/>
+          </w:tcPr>
+          <w:p>
+            <w:pPr>
+              <w:spacing w:after="0" w:before="0" w:line="260" w:lineRule="exact"/>
+            </w:pPr>
+            <w:r>
+              <w:rPr>
+                <w:rFonts w:ascii="Times New Roman" w:hAnsi="Times New Roman"/>
+                <w:b w:val="0"/>
+                <w:color w:val="808080"/>
+                <w:sz w:val="20"/>
+              </w:rPr>
+              <w:t>// Step 3: Effort-Gated Analysis Loop</w:t>
+            </w:r>
+          </w:p>
+        </w:tc>
+      </w:tr>
+      <w:tr>
+        <w:trPr>
+          <w:trHeight w:val="280" w:hRule="atLeast"/>
+        </w:trPr>
+        <w:tc>
+          <w:tcPr>
+            <w:tcW w:type="dxa" w:w="680"/>
+            <w:tcBorders>
+              <w:top w:val="none" w:sz="0" w:space="0" w:color="auto"/>
+              <w:left w:val="none" w:sz="0" w:space="0" w:color="auto"/>
+              <w:bottom w:val="none" w:sz="0" w:space="0" w:color="auto"/>
+              <w:right w:val="none" w:sz="0" w:space="0" w:color="auto"/>
+            </w:tcBorders>
+            <w:vAlign w:val="center"/>
+          </w:tcPr>
+          <w:p>
+            <w:pPr>
+              <w:spacing w:after="0" w:before="0" w:line="260" w:lineRule="exact"/>
+              <w:jc w:val="right"/>
+            </w:pPr>
+            <w:r>
+              <w:rPr>
+                <w:rFonts w:ascii="Times New Roman" w:hAnsi="Times New Roman"/>
+                <w:sz w:val="20"/>
+              </w:rPr>
+              <w:t>5:</w:t>
+            </w:r>
+          </w:p>
+        </w:tc>
+        <w:tc>
+          <w:tcPr>
+            <w:tcW w:type="dxa" w:w="7938"/>
+            <w:tcBorders>
+              <w:top w:val="none" w:sz="0" w:space="0" w:color="auto"/>
+              <w:left w:val="none" w:sz="0" w:space="0" w:color="auto"/>
+              <w:bottom w:val="none" w:sz="0" w:space="0" w:color="auto"/>
+              <w:right w:val="none" w:sz="0" w:space="0" w:color="auto"/>
+            </w:tcBorders>
+            <w:vAlign w:val="center"/>
+          </w:tcPr>
+          <w:p>
+            <w:pPr>
+              <w:spacing w:after="0" w:before="0" w:line="260" w:lineRule="exact"/>
+            </w:pPr>
+            <w:r>
+              <w:rPr>
+                <w:rFonts w:ascii="Times New Roman" w:hAnsi="Times New Roman"/>
+                <w:b w:val="0"/>
+                <w:i w:val="0"/>
+                <w:sz w:val="20"/>
+              </w:rPr>
+              <w:t xml:space="preserve">pass </w:t>
+            </w:r>
+            <w:r>
+              <w:rPr>
+                <w:rFonts w:ascii="Times New Roman" w:hAnsi="Times New Roman"/>
+                <w:b w:val="0"/>
+                <w:i w:val="0"/>
+                <w:sz w:val="20"/>
+              </w:rPr>
+              <w:t>←</w:t>
+            </w:r>
+            <w:r>
+              <w:rPr>
+                <w:rFonts w:ascii="Times New Roman" w:hAnsi="Times New Roman"/>
+                <w:b w:val="0"/>
+                <w:i w:val="0"/>
+                <w:sz w:val="20"/>
+              </w:rPr>
+              <w:t xml:space="preserve"> 0</w:t>
+            </w:r>
+          </w:p>
+        </w:tc>
+      </w:tr>
+      <w:tr>
+        <w:trPr>
+          <w:trHeight w:val="280" w:hRule="atLeast"/>
+        </w:trPr>
+        <w:tc>
+          <w:tcPr>
+            <w:tcW w:type="dxa" w:w="680"/>
+            <w:tcBorders>
+              <w:top w:val="none" w:sz="0" w:space="0" w:color="auto"/>
+              <w:left w:val="none" w:sz="0" w:space="0" w:color="auto"/>
+              <w:bottom w:val="none" w:sz="0" w:space="0" w:color="auto"/>
+              <w:right w:val="none" w:sz="0" w:space="0" w:color="auto"/>
+            </w:tcBorders>
+            <w:vAlign w:val="center"/>
+          </w:tcPr>
+          <w:p>
+            <w:pPr>
+              <w:spacing w:after="0" w:before="0" w:line="260" w:lineRule="exact"/>
+              <w:jc w:val="right"/>
+            </w:pPr>
+            <w:r>
+              <w:rPr>
+                <w:rFonts w:ascii="Times New Roman" w:hAnsi="Times New Roman"/>
+                <w:sz w:val="20"/>
+              </w:rPr>
+              <w:t>6:</w:t>
+            </w:r>
+          </w:p>
+        </w:tc>
+        <w:tc>
+          <w:tcPr>
+            <w:tcW w:type="dxa" w:w="7938"/>
+            <w:tcBorders>
+              <w:top w:val="none" w:sz="0" w:space="0" w:color="auto"/>
+              <w:left w:val="none" w:sz="0" w:space="0" w:color="auto"/>
+              <w:bottom w:val="none" w:sz="0" w:space="0" w:color="auto"/>
+              <w:right w:val="none" w:sz="0" w:space="0" w:color="auto"/>
+            </w:tcBorders>
+            <w:vAlign w:val="center"/>
+          </w:tcPr>
+          <w:p>
+            <w:pPr>
+              <w:spacing w:after="0" w:before="0" w:line="260" w:lineRule="exact"/>
+            </w:pPr>
+            <w:r>
+              <w:rPr>
+                <w:rFonts w:ascii="Times New Roman" w:hAnsi="Times New Roman"/>
+                <w:b/>
+                <w:i w:val="0"/>
+                <w:sz w:val="20"/>
+              </w:rPr>
+              <w:t>while</w:t>
+            </w:r>
+            <w:r>
+              <w:rPr>
+                <w:rFonts w:ascii="Times New Roman" w:hAnsi="Times New Roman"/>
+                <w:b w:val="0"/>
+                <w:i w:val="0"/>
+                <w:sz w:val="20"/>
+              </w:rPr>
+              <w:t xml:space="preserve"> AnalysisEffort(effort, pass) = continue </w:t>
+            </w:r>
+            <w:r>
+              <w:rPr>
+                <w:rFonts w:ascii="Times New Roman" w:hAnsi="Times New Roman"/>
+                <w:b/>
+                <w:i w:val="0"/>
+                <w:sz w:val="20"/>
+              </w:rPr>
+              <w:t>do</w:t>
+            </w:r>
+          </w:p>
+        </w:tc>
+      </w:tr>
+      <w:tr>
+        <w:trPr>
+          <w:trHeight w:val="280" w:hRule="atLeast"/>
+        </w:trPr>
+        <w:tc>
+          <w:tcPr>
+            <w:tcW w:type="dxa" w:w="680"/>
+            <w:tcBorders>
+              <w:top w:val="none" w:sz="0" w:space="0" w:color="auto"/>
+              <w:left w:val="none" w:sz="0" w:space="0" w:color="auto"/>
+              <w:bottom w:val="none" w:sz="0" w:space="0" w:color="auto"/>
+              <w:right w:val="none" w:sz="0" w:space="0" w:color="auto"/>
+            </w:tcBorders>
+            <w:vAlign w:val="center"/>
+          </w:tcPr>
+          <w:p>
+            <w:pPr>
+              <w:spacing w:after="0" w:before="0" w:line="260" w:lineRule="exact"/>
+              <w:jc w:val="right"/>
+            </w:pPr>
+            <w:r>
+              <w:rPr>
+                <w:rFonts w:ascii="Times New Roman" w:hAnsi="Times New Roman"/>
+                <w:sz w:val="20"/>
+              </w:rPr>
+              <w:t>7:</w:t>
+            </w:r>
+          </w:p>
+        </w:tc>
+        <w:tc>
+          <w:tcPr>
+            <w:tcW w:type="dxa" w:w="7938"/>
+            <w:tcBorders>
+              <w:top w:val="none" w:sz="0" w:space="0" w:color="auto"/>
+              <w:left w:val="none" w:sz="0" w:space="0" w:color="auto"/>
+              <w:bottom w:val="none" w:sz="0" w:space="0" w:color="auto"/>
+              <w:right w:val="none" w:sz="0" w:space="0" w:color="auto"/>
+            </w:tcBorders>
+            <w:vAlign w:val="center"/>
+          </w:tcPr>
+          <w:p>
+            <w:pPr>
+              <w:spacing w:after="0" w:before="0" w:line="260" w:lineRule="exact"/>
+              <w:ind w:left="283"/>
+            </w:pPr>
+            <w:r>
+              <w:rPr>
+                <w:rFonts w:ascii="Times New Roman" w:hAnsi="Times New Roman"/>
+                <w:b w:val="0"/>
+                <w:i w:val="0"/>
+                <w:sz w:val="20"/>
+              </w:rPr>
+              <w:t xml:space="preserve">selected </w:t>
+            </w:r>
+            <w:r>
+              <w:rPr>
+                <w:rFonts w:ascii="Times New Roman" w:hAnsi="Times New Roman"/>
+                <w:b w:val="0"/>
+                <w:i w:val="0"/>
+                <w:sz w:val="20"/>
+              </w:rPr>
+              <w:t>←</w:t>
+            </w:r>
+            <w:r>
+              <w:rPr>
+                <w:rFonts w:ascii="Times New Roman" w:hAnsi="Times New Roman"/>
+                <w:b w:val="0"/>
+                <w:i w:val="0"/>
+                <w:sz w:val="20"/>
+              </w:rPr>
+              <w:t xml:space="preserve"> TaskAssess(rootTask);   </w:t>
+            </w:r>
+            <w:r>
+              <w:rPr>
+                <w:rFonts w:ascii="Times New Roman" w:hAnsi="Times New Roman"/>
+                <w:b/>
+                <w:i w:val="0"/>
+                <w:sz w:val="20"/>
+              </w:rPr>
+              <w:t>if</w:t>
+            </w:r>
+            <w:r>
+              <w:rPr>
+                <w:rFonts w:ascii="Times New Roman" w:hAnsi="Times New Roman"/>
+                <w:b w:val="0"/>
+                <w:i w:val="0"/>
+                <w:sz w:val="20"/>
+              </w:rPr>
+              <w:t xml:space="preserve"> selected = NULL </w:t>
+            </w:r>
+            <w:r>
+              <w:rPr>
+                <w:rFonts w:ascii="Times New Roman" w:hAnsi="Times New Roman"/>
+                <w:b/>
+                <w:i w:val="0"/>
+                <w:sz w:val="20"/>
+              </w:rPr>
+              <w:t>then</w:t>
+            </w:r>
+            <w:r>
+              <w:rPr>
+                <w:rFonts w:ascii="Times New Roman" w:hAnsi="Times New Roman"/>
+                <w:b w:val="0"/>
+                <w:i w:val="0"/>
+                <w:sz w:val="20"/>
+              </w:rPr>
+              <w:t xml:space="preserve"> break</w:t>
+            </w:r>
+          </w:p>
+        </w:tc>
+      </w:tr>
+      <w:tr>
+        <w:trPr>
+          <w:trHeight w:val="280" w:hRule="atLeast"/>
+        </w:trPr>
+        <w:tc>
+          <w:tcPr>
+            <w:tcW w:type="dxa" w:w="680"/>
+            <w:tcBorders>
+              <w:top w:val="none" w:sz="0" w:space="0" w:color="auto"/>
+              <w:left w:val="none" w:sz="0" w:space="0" w:color="auto"/>
+              <w:bottom w:val="none" w:sz="0" w:space="0" w:color="auto"/>
+              <w:right w:val="none" w:sz="0" w:space="0" w:color="auto"/>
+            </w:tcBorders>
+            <w:vAlign w:val="center"/>
+          </w:tcPr>
+          <w:p>
+            <w:pPr>
+              <w:spacing w:after="0" w:before="0" w:line="260" w:lineRule="exact"/>
+              <w:jc w:val="right"/>
+            </w:pPr>
+            <w:r>
+              <w:rPr>
+                <w:rFonts w:ascii="Times New Roman" w:hAnsi="Times New Roman"/>
+                <w:sz w:val="20"/>
+              </w:rPr>
+              <w:t>8:</w:t>
+            </w:r>
+          </w:p>
+        </w:tc>
+        <w:tc>
+          <w:tcPr>
+            <w:tcW w:type="dxa" w:w="7938"/>
+            <w:tcBorders>
+              <w:top w:val="none" w:sz="0" w:space="0" w:color="auto"/>
+              <w:left w:val="none" w:sz="0" w:space="0" w:color="auto"/>
+              <w:bottom w:val="none" w:sz="0" w:space="0" w:color="auto"/>
+              <w:right w:val="none" w:sz="0" w:space="0" w:color="auto"/>
+            </w:tcBorders>
+            <w:vAlign w:val="center"/>
+          </w:tcPr>
+          <w:p>
+            <w:pPr>
+              <w:spacing w:after="0" w:before="0" w:line="260" w:lineRule="exact"/>
+              <w:ind w:left="283"/>
+            </w:pPr>
+            <w:r>
+              <w:rPr>
+                <w:rFonts w:ascii="Times New Roman" w:hAnsi="Times New Roman"/>
+                <w:b w:val="0"/>
+                <w:i w:val="0"/>
+                <w:sz w:val="20"/>
+              </w:rPr>
+              <w:t xml:space="preserve">TaskAnalyze(selected, effort_loop);   pass </w:t>
+            </w:r>
+            <w:r>
+              <w:rPr>
+                <w:rFonts w:ascii="Times New Roman" w:hAnsi="Times New Roman"/>
+                <w:b w:val="0"/>
+                <w:i w:val="0"/>
+                <w:sz w:val="20"/>
+              </w:rPr>
+              <w:t>←</w:t>
+            </w:r>
+            <w:r>
+              <w:rPr>
+                <w:rFonts w:ascii="Times New Roman" w:hAnsi="Times New Roman"/>
+                <w:b w:val="0"/>
+                <w:i w:val="0"/>
+                <w:sz w:val="20"/>
+              </w:rPr>
+              <w:t xml:space="preserve"> pass + 1</w:t>
+            </w:r>
+          </w:p>
+        </w:tc>
+      </w:tr>
+      <w:tr>
+        <w:trPr>
+          <w:trHeight w:val="280" w:hRule="atLeast"/>
+        </w:trPr>
+        <w:tc>
+          <w:tcPr>
+            <w:tcW w:type="dxa" w:w="680"/>
+            <w:tcBorders>
+              <w:top w:val="none" w:sz="0" w:space="0" w:color="auto"/>
+              <w:left w:val="none" w:sz="0" w:space="0" w:color="auto"/>
+              <w:bottom w:val="none" w:sz="0" w:space="0" w:color="auto"/>
+              <w:right w:val="none" w:sz="0" w:space="0" w:color="auto"/>
+            </w:tcBorders>
+            <w:vAlign w:val="center"/>
+          </w:tcPr>
+          <w:p>
+            <w:pPr>
+              <w:spacing w:after="0" w:before="0" w:line="260" w:lineRule="exact"/>
+              <w:jc w:val="right"/>
+            </w:pPr>
+            <w:r>
+              <w:rPr>
+                <w:rFonts w:ascii="Times New Roman" w:hAnsi="Times New Roman"/>
+                <w:sz w:val="20"/>
+              </w:rPr>
+              <w:t>9:</w:t>
+            </w:r>
+          </w:p>
+        </w:tc>
+        <w:tc>
+          <w:tcPr>
+            <w:tcW w:type="dxa" w:w="7938"/>
+            <w:tcBorders>
+              <w:top w:val="none" w:sz="0" w:space="0" w:color="auto"/>
+              <w:left w:val="none" w:sz="0" w:space="0" w:color="auto"/>
+              <w:bottom w:val="none" w:sz="0" w:space="0" w:color="auto"/>
+              <w:right w:val="none" w:sz="0" w:space="0" w:color="auto"/>
+            </w:tcBorders>
+            <w:vAlign w:val="center"/>
+          </w:tcPr>
+          <w:p>
+            <w:pPr>
+              <w:spacing w:after="0" w:before="0" w:line="260" w:lineRule="exact"/>
+            </w:pPr>
+            <w:r>
+              <w:rPr>
+                <w:rFonts w:ascii="Times New Roman" w:hAnsi="Times New Roman"/>
+                <w:b/>
+                <w:i w:val="0"/>
+                <w:sz w:val="20"/>
+              </w:rPr>
+              <w:t>end</w:t>
+            </w:r>
+            <w:r>
+              <w:rPr>
+                <w:rFonts w:ascii="Times New Roman" w:hAnsi="Times New Roman"/>
+                <w:b w:val="0"/>
+                <w:i w:val="0"/>
+                <w:sz w:val="20"/>
+              </w:rPr>
+              <w:t xml:space="preserve"> </w:t>
+            </w:r>
+            <w:r>
+              <w:rPr>
+                <w:rFonts w:ascii="Times New Roman" w:hAnsi="Times New Roman"/>
+                <w:b/>
+                <w:i w:val="0"/>
+                <w:sz w:val="20"/>
+              </w:rPr>
+              <w:t>while</w:t>
+            </w:r>
+          </w:p>
+        </w:tc>
+      </w:tr>
+      <w:tr>
+        <w:trPr>
+          <w:trHeight w:val="160" w:hRule="atLeast"/>
+        </w:trPr>
+        <w:tc>
+          <w:tcPr>
+            <w:tcW w:type="dxa" w:w="680"/>
+            <w:tcBorders>
+              <w:top w:val="none" w:sz="0" w:space="0" w:color="auto"/>
+              <w:left w:val="none" w:sz="0" w:space="0" w:color="auto"/>
+              <w:bottom w:val="none" w:sz="0" w:space="0" w:color="auto"/>
+              <w:right w:val="none" w:sz="0" w:space="0" w:color="auto"/>
+            </w:tcBorders>
+            <w:vAlign w:val="center"/>
+          </w:tcPr>
+          <w:p/>
+        </w:tc>
+        <w:tc>
+          <w:tcPr>
+            <w:tcW w:type="dxa" w:w="7938"/>
+            <w:tcBorders>
+              <w:top w:val="none" w:sz="0" w:space="0" w:color="auto"/>
+              <w:left w:val="none" w:sz="0" w:space="0" w:color="auto"/>
+              <w:bottom w:val="none" w:sz="0" w:space="0" w:color="auto"/>
+              <w:right w:val="none" w:sz="0" w:space="0" w:color="auto"/>
+            </w:tcBorders>
+            <w:vAlign w:val="center"/>
+          </w:tcPr>
+          <w:p>
+            <w:pPr>
+              <w:spacing w:after="0" w:before="0" w:line="260" w:lineRule="exact"/>
+            </w:pPr>
+            <w:r>
+              <w:rPr>
+                <w:rFonts w:ascii="Times New Roman" w:hAnsi="Times New Roman"/>
+                <w:b w:val="0"/>
+                <w:color w:val="808080"/>
+                <w:sz w:val="20"/>
+              </w:rPr>
+              <w:t>// Step 4: Execute and Review Loop</w:t>
+            </w:r>
+          </w:p>
+        </w:tc>
+      </w:tr>
+      <w:tr>
+        <w:trPr>
+          <w:trHeight w:val="280" w:hRule="atLeast"/>
+        </w:trPr>
+        <w:tc>
+          <w:tcPr>
+            <w:tcW w:type="dxa" w:w="680"/>
+            <w:tcBorders>
+              <w:top w:val="none" w:sz="0" w:space="0" w:color="auto"/>
+              <w:left w:val="none" w:sz="0" w:space="0" w:color="auto"/>
+              <w:bottom w:val="none" w:sz="0" w:space="0" w:color="auto"/>
+              <w:right w:val="none" w:sz="0" w:space="0" w:color="auto"/>
+            </w:tcBorders>
+            <w:vAlign w:val="center"/>
+          </w:tcPr>
+          <w:p>
+            <w:pPr>
+              <w:spacing w:after="0" w:before="0" w:line="260" w:lineRule="exact"/>
+              <w:jc w:val="right"/>
+            </w:pPr>
+            <w:r>
+              <w:rPr>
+                <w:rFonts w:ascii="Times New Roman" w:hAnsi="Times New Roman"/>
+                <w:sz w:val="20"/>
+              </w:rPr>
+              <w:t>10:</w:t>
+            </w:r>
+          </w:p>
+        </w:tc>
+        <w:tc>
+          <w:tcPr>
+            <w:tcW w:type="dxa" w:w="7938"/>
+            <w:tcBorders>
+              <w:top w:val="none" w:sz="0" w:space="0" w:color="auto"/>
+              <w:left w:val="none" w:sz="0" w:space="0" w:color="auto"/>
+              <w:bottom w:val="none" w:sz="0" w:space="0" w:color="auto"/>
+              <w:right w:val="none" w:sz="0" w:space="0" w:color="auto"/>
+            </w:tcBorders>
+            <w:vAlign w:val="center"/>
+          </w:tcPr>
+          <w:p>
+            <w:pPr>
+              <w:spacing w:after="0" w:before="0" w:line="260" w:lineRule="exact"/>
+            </w:pPr>
+            <w:r>
+              <w:rPr>
+                <w:rFonts w:ascii="Times New Roman" w:hAnsi="Times New Roman"/>
+                <w:b w:val="0"/>
+                <w:i w:val="0"/>
+                <w:sz w:val="20"/>
+              </w:rPr>
+              <w:t xml:space="preserve">completedResults </w:t>
+            </w:r>
+            <w:r>
+              <w:rPr>
+                <w:rFonts w:ascii="Times New Roman" w:hAnsi="Times New Roman"/>
+                <w:b w:val="0"/>
+                <w:i w:val="0"/>
+                <w:sz w:val="20"/>
+              </w:rPr>
+              <w:t>←</w:t>
+            </w:r>
+            <w:r>
+              <w:rPr>
+                <w:rFonts w:ascii="Times New Roman" w:hAnsi="Times New Roman"/>
+                <w:b w:val="0"/>
+                <w:i w:val="0"/>
+                <w:sz w:val="20"/>
+              </w:rPr>
+              <w:t xml:space="preserve"> NULL</w:t>
+            </w:r>
+          </w:p>
+        </w:tc>
+      </w:tr>
+      <w:tr>
+        <w:trPr>
+          <w:trHeight w:val="280" w:hRule="atLeast"/>
+        </w:trPr>
+        <w:tc>
+          <w:tcPr>
+            <w:tcW w:type="dxa" w:w="680"/>
+            <w:tcBorders>
+              <w:top w:val="none" w:sz="0" w:space="0" w:color="auto"/>
+              <w:left w:val="none" w:sz="0" w:space="0" w:color="auto"/>
+              <w:bottom w:val="none" w:sz="0" w:space="0" w:color="auto"/>
+              <w:right w:val="none" w:sz="0" w:space="0" w:color="auto"/>
+            </w:tcBorders>
+            <w:vAlign w:val="center"/>
+          </w:tcPr>
+          <w:p>
+            <w:pPr>
+              <w:spacing w:after="0" w:before="0" w:line="260" w:lineRule="exact"/>
+              <w:jc w:val="right"/>
+            </w:pPr>
+            <w:r>
+              <w:rPr>
+                <w:rFonts w:ascii="Times New Roman" w:hAnsi="Times New Roman"/>
+                <w:sz w:val="20"/>
+              </w:rPr>
+              <w:t>11:</w:t>
+            </w:r>
+          </w:p>
+        </w:tc>
+        <w:tc>
+          <w:tcPr>
+            <w:tcW w:type="dxa" w:w="7938"/>
+            <w:tcBorders>
+              <w:top w:val="none" w:sz="0" w:space="0" w:color="auto"/>
+              <w:left w:val="none" w:sz="0" w:space="0" w:color="auto"/>
+              <w:bottom w:val="none" w:sz="0" w:space="0" w:color="auto"/>
+              <w:right w:val="none" w:sz="0" w:space="0" w:color="auto"/>
+            </w:tcBorders>
+            <w:vAlign w:val="center"/>
+          </w:tcPr>
+          <w:p>
+            <w:pPr>
+              <w:spacing w:after="0" w:before="0" w:line="260" w:lineRule="exact"/>
+            </w:pPr>
+            <w:r>
+              <w:rPr>
+                <w:rFonts w:ascii="Times New Roman" w:hAnsi="Times New Roman"/>
+                <w:b w:val="0"/>
+                <w:i w:val="0"/>
+                <w:sz w:val="20"/>
+              </w:rPr>
+              <w:t xml:space="preserve">active </w:t>
+            </w:r>
+            <w:r>
+              <w:rPr>
+                <w:rFonts w:ascii="Times New Roman" w:hAnsi="Times New Roman"/>
+                <w:b w:val="0"/>
+                <w:i w:val="0"/>
+                <w:sz w:val="20"/>
+              </w:rPr>
+              <w:t>←</w:t>
+            </w:r>
+            <w:r>
+              <w:rPr>
+                <w:rFonts w:ascii="Times New Roman" w:hAnsi="Times New Roman"/>
+                <w:b w:val="0"/>
+                <w:i w:val="0"/>
+                <w:sz w:val="20"/>
+              </w:rPr>
+              <w:t xml:space="preserve"> NextTask(rootTask)</w:t>
+            </w:r>
+          </w:p>
+        </w:tc>
+      </w:tr>
+      <w:tr>
+        <w:trPr>
+          <w:trHeight w:val="280" w:hRule="atLeast"/>
+        </w:trPr>
+        <w:tc>
+          <w:tcPr>
+            <w:tcW w:type="dxa" w:w="680"/>
+            <w:tcBorders>
+              <w:top w:val="none" w:sz="0" w:space="0" w:color="auto"/>
+              <w:left w:val="none" w:sz="0" w:space="0" w:color="auto"/>
+              <w:bottom w:val="none" w:sz="0" w:space="0" w:color="auto"/>
+              <w:right w:val="none" w:sz="0" w:space="0" w:color="auto"/>
+            </w:tcBorders>
+            <w:vAlign w:val="center"/>
+          </w:tcPr>
+          <w:p>
+            <w:pPr>
+              <w:spacing w:after="0" w:before="0" w:line="260" w:lineRule="exact"/>
+              <w:jc w:val="right"/>
+            </w:pPr>
+            <w:r>
+              <w:rPr>
+                <w:rFonts w:ascii="Times New Roman" w:hAnsi="Times New Roman"/>
+                <w:sz w:val="20"/>
+              </w:rPr>
+              <w:t>12:</w:t>
+            </w:r>
+          </w:p>
+        </w:tc>
+        <w:tc>
+          <w:tcPr>
+            <w:tcW w:type="dxa" w:w="7938"/>
+            <w:tcBorders>
+              <w:top w:val="none" w:sz="0" w:space="0" w:color="auto"/>
+              <w:left w:val="none" w:sz="0" w:space="0" w:color="auto"/>
+              <w:bottom w:val="none" w:sz="0" w:space="0" w:color="auto"/>
+              <w:right w:val="none" w:sz="0" w:space="0" w:color="auto"/>
+            </w:tcBorders>
+            <w:vAlign w:val="center"/>
+          </w:tcPr>
+          <w:p>
+            <w:pPr>
+              <w:spacing w:after="0" w:before="0" w:line="260" w:lineRule="exact"/>
+            </w:pPr>
+            <w:r>
+              <w:rPr>
+                <w:rFonts w:ascii="Times New Roman" w:hAnsi="Times New Roman"/>
+                <w:b/>
+                <w:i w:val="0"/>
+                <w:sz w:val="20"/>
+              </w:rPr>
+              <w:t>while</w:t>
+            </w:r>
+            <w:r>
+              <w:rPr>
+                <w:rFonts w:ascii="Times New Roman" w:hAnsi="Times New Roman"/>
+                <w:b w:val="0"/>
+                <w:i w:val="0"/>
+                <w:sz w:val="20"/>
+              </w:rPr>
+              <w:t xml:space="preserve"> active </w:t>
+            </w:r>
+            <w:r>
+              <w:rPr>
+                <w:rFonts w:ascii="Times New Roman" w:hAnsi="Times New Roman"/>
+                <w:b w:val="0"/>
+                <w:i w:val="0"/>
+                <w:sz w:val="20"/>
+              </w:rPr>
+              <w:t>≠</w:t>
+            </w:r>
+            <w:r>
+              <w:rPr>
+                <w:rFonts w:ascii="Times New Roman" w:hAnsi="Times New Roman"/>
+                <w:b w:val="0"/>
+                <w:i w:val="0"/>
+                <w:sz w:val="20"/>
+              </w:rPr>
+              <w:t xml:space="preserve"> NULL </w:t>
+            </w:r>
+            <w:r>
+              <w:rPr>
+                <w:rFonts w:ascii="Times New Roman" w:hAnsi="Times New Roman"/>
+                <w:b/>
+                <w:i w:val="0"/>
+                <w:sz w:val="20"/>
+              </w:rPr>
+              <w:t>do</w:t>
+            </w:r>
+          </w:p>
+        </w:tc>
+      </w:tr>
+      <w:tr>
+        <w:trPr>
+          <w:trHeight w:val="280" w:hRule="atLeast"/>
+        </w:trPr>
+        <w:tc>
+          <w:tcPr>
+            <w:tcW w:type="dxa" w:w="680"/>
+            <w:tcBorders>
+              <w:top w:val="none" w:sz="0" w:space="0" w:color="auto"/>
+              <w:left w:val="none" w:sz="0" w:space="0" w:color="auto"/>
+              <w:bottom w:val="none" w:sz="0" w:space="0" w:color="auto"/>
+              <w:right w:val="none" w:sz="0" w:space="0" w:color="auto"/>
+            </w:tcBorders>
+            <w:vAlign w:val="center"/>
+          </w:tcPr>
+          <w:p>
+            <w:pPr>
+              <w:spacing w:after="0" w:before="0" w:line="260" w:lineRule="exact"/>
+              <w:jc w:val="right"/>
+            </w:pPr>
+            <w:r>
+              <w:rPr>
+                <w:rFonts w:ascii="Times New Roman" w:hAnsi="Times New Roman"/>
+                <w:sz w:val="20"/>
+              </w:rPr>
+              <w:t>13:</w:t>
+            </w:r>
+          </w:p>
+        </w:tc>
+        <w:tc>
+          <w:tcPr>
+            <w:tcW w:type="dxa" w:w="7938"/>
+            <w:tcBorders>
+              <w:top w:val="none" w:sz="0" w:space="0" w:color="auto"/>
+              <w:left w:val="none" w:sz="0" w:space="0" w:color="auto"/>
+              <w:bottom w:val="none" w:sz="0" w:space="0" w:color="auto"/>
+              <w:right w:val="none" w:sz="0" w:space="0" w:color="auto"/>
+            </w:tcBorders>
+            <w:vAlign w:val="center"/>
+          </w:tcPr>
+          <w:p>
+            <w:pPr>
+              <w:spacing w:after="0" w:before="0" w:line="260" w:lineRule="exact"/>
+              <w:ind w:left="283"/>
+            </w:pPr>
+            <w:r>
+              <w:rPr>
+                <w:rFonts w:ascii="Times New Roman" w:hAnsi="Times New Roman"/>
+                <w:b w:val="0"/>
+                <w:i w:val="0"/>
+                <w:sz w:val="20"/>
+              </w:rPr>
+              <w:t xml:space="preserve">context </w:t>
+            </w:r>
+            <w:r>
+              <w:rPr>
+                <w:rFonts w:ascii="Times New Roman" w:hAnsi="Times New Roman"/>
+                <w:b w:val="0"/>
+                <w:i w:val="0"/>
+                <w:sz w:val="20"/>
+              </w:rPr>
+              <w:t>←</w:t>
+            </w:r>
+            <w:r>
+              <w:rPr>
+                <w:rFonts w:ascii="Times New Roman" w:hAnsi="Times New Roman"/>
+                <w:b w:val="0"/>
+                <w:i w:val="0"/>
+                <w:sz w:val="20"/>
+              </w:rPr>
+              <w:t xml:space="preserve"> BuildContext(active, completedResults)</w:t>
+            </w:r>
+          </w:p>
+        </w:tc>
+      </w:tr>
+      <w:tr>
+        <w:trPr>
+          <w:trHeight w:val="280" w:hRule="atLeast"/>
+        </w:trPr>
+        <w:tc>
+          <w:tcPr>
+            <w:tcW w:type="dxa" w:w="680"/>
+            <w:tcBorders>
+              <w:top w:val="none" w:sz="0" w:space="0" w:color="auto"/>
+              <w:left w:val="none" w:sz="0" w:space="0" w:color="auto"/>
+              <w:bottom w:val="none" w:sz="0" w:space="0" w:color="auto"/>
+              <w:right w:val="none" w:sz="0" w:space="0" w:color="auto"/>
+            </w:tcBorders>
+            <w:vAlign w:val="center"/>
+          </w:tcPr>
+          <w:p>
+            <w:pPr>
+              <w:spacing w:after="0" w:before="0" w:line="260" w:lineRule="exact"/>
+              <w:jc w:val="right"/>
+            </w:pPr>
+            <w:r>
+              <w:rPr>
+                <w:rFonts w:ascii="Times New Roman" w:hAnsi="Times New Roman"/>
+                <w:sz w:val="20"/>
+              </w:rPr>
+              <w:t>14:</w:t>
+            </w:r>
+          </w:p>
+        </w:tc>
+        <w:tc>
+          <w:tcPr>
+            <w:tcW w:type="dxa" w:w="7938"/>
+            <w:tcBorders>
+              <w:top w:val="none" w:sz="0" w:space="0" w:color="auto"/>
+              <w:left w:val="none" w:sz="0" w:space="0" w:color="auto"/>
+              <w:bottom w:val="none" w:sz="0" w:space="0" w:color="auto"/>
+              <w:right w:val="none" w:sz="0" w:space="0" w:color="auto"/>
+            </w:tcBorders>
+            <w:vAlign w:val="center"/>
+          </w:tcPr>
+          <w:p>
+            <w:pPr>
+              <w:spacing w:after="0" w:before="0" w:line="260" w:lineRule="exact"/>
+              <w:ind w:left="283"/>
+            </w:pPr>
+            <w:r>
+              <w:rPr>
+                <w:rFonts w:ascii="Times New Roman" w:hAnsi="Times New Roman"/>
+                <w:b w:val="0"/>
+                <w:i w:val="0"/>
+                <w:sz w:val="20"/>
+              </w:rPr>
+              <w:t xml:space="preserve">result </w:t>
+            </w:r>
+            <w:r>
+              <w:rPr>
+                <w:rFonts w:ascii="Times New Roman" w:hAnsi="Times New Roman"/>
+                <w:b w:val="0"/>
+                <w:i w:val="0"/>
+                <w:sz w:val="20"/>
+              </w:rPr>
+              <w:t>←</w:t>
+            </w:r>
+            <w:r>
+              <w:rPr>
+                <w:rFonts w:ascii="Times New Roman" w:hAnsi="Times New Roman"/>
+                <w:b w:val="0"/>
+                <w:i w:val="0"/>
+                <w:sz w:val="20"/>
+              </w:rPr>
+              <w:t xml:space="preserve"> TaskExecute(active, context);   retries </w:t>
+            </w:r>
+            <w:r>
+              <w:rPr>
+                <w:rFonts w:ascii="Times New Roman" w:hAnsi="Times New Roman"/>
+                <w:b w:val="0"/>
+                <w:i w:val="0"/>
+                <w:sz w:val="20"/>
+              </w:rPr>
+              <w:t>←</w:t>
+            </w:r>
+            <w:r>
+              <w:rPr>
+                <w:rFonts w:ascii="Times New Roman" w:hAnsi="Times New Roman"/>
+                <w:b w:val="0"/>
+                <w:i w:val="0"/>
+                <w:sz w:val="20"/>
+              </w:rPr>
+              <w:t xml:space="preserve"> 0</w:t>
+            </w:r>
+          </w:p>
+        </w:tc>
+      </w:tr>
+      <w:tr>
+        <w:trPr>
+          <w:trHeight w:val="280" w:hRule="atLeast"/>
+        </w:trPr>
+        <w:tc>
+          <w:tcPr>
+            <w:tcW w:type="dxa" w:w="680"/>
+            <w:tcBorders>
+              <w:top w:val="none" w:sz="0" w:space="0" w:color="auto"/>
+              <w:left w:val="none" w:sz="0" w:space="0" w:color="auto"/>
+              <w:bottom w:val="none" w:sz="0" w:space="0" w:color="auto"/>
+              <w:right w:val="none" w:sz="0" w:space="0" w:color="auto"/>
+            </w:tcBorders>
+            <w:vAlign w:val="center"/>
+          </w:tcPr>
+          <w:p>
+            <w:pPr>
+              <w:spacing w:after="0" w:before="0" w:line="260" w:lineRule="exact"/>
+              <w:jc w:val="right"/>
+            </w:pPr>
+            <w:r>
+              <w:rPr>
+                <w:rFonts w:ascii="Times New Roman" w:hAnsi="Times New Roman"/>
+                <w:sz w:val="20"/>
+              </w:rPr>
+              <w:t>15:</w:t>
+            </w:r>
+          </w:p>
+        </w:tc>
+        <w:tc>
+          <w:tcPr>
+            <w:tcW w:type="dxa" w:w="7938"/>
+            <w:tcBorders>
+              <w:top w:val="none" w:sz="0" w:space="0" w:color="auto"/>
+              <w:left w:val="none" w:sz="0" w:space="0" w:color="auto"/>
+              <w:bottom w:val="none" w:sz="0" w:space="0" w:color="auto"/>
+              <w:right w:val="none" w:sz="0" w:space="0" w:color="auto"/>
+            </w:tcBorders>
+            <w:vAlign w:val="center"/>
+          </w:tcPr>
+          <w:p>
+            <w:pPr>
+              <w:spacing w:after="0" w:before="0" w:line="260" w:lineRule="exact"/>
+              <w:ind w:left="283"/>
+            </w:pPr>
+            <w:r>
+              <w:rPr>
+                <w:rFonts w:ascii="Times New Roman" w:hAnsi="Times New Roman"/>
+                <w:b w:val="0"/>
+                <w:i w:val="0"/>
+                <w:sz w:val="20"/>
+              </w:rPr>
+              <w:t xml:space="preserve">decision </w:t>
+            </w:r>
+            <w:r>
+              <w:rPr>
+                <w:rFonts w:ascii="Times New Roman" w:hAnsi="Times New Roman"/>
+                <w:b w:val="0"/>
+                <w:i w:val="0"/>
+                <w:sz w:val="20"/>
+              </w:rPr>
+              <w:t>←</w:t>
+            </w:r>
+            <w:r>
+              <w:rPr>
+                <w:rFonts w:ascii="Times New Roman" w:hAnsi="Times New Roman"/>
+                <w:b w:val="0"/>
+                <w:i w:val="0"/>
+                <w:sz w:val="20"/>
+              </w:rPr>
+              <w:t xml:space="preserve"> ResultReview(result)</w:t>
+            </w:r>
+          </w:p>
+        </w:tc>
+      </w:tr>
+      <w:tr>
+        <w:trPr>
+          <w:trHeight w:val="280" w:hRule="atLeast"/>
+        </w:trPr>
+        <w:tc>
+          <w:tcPr>
+            <w:tcW w:type="dxa" w:w="680"/>
+            <w:tcBorders>
+              <w:top w:val="none" w:sz="0" w:space="0" w:color="auto"/>
+              <w:left w:val="none" w:sz="0" w:space="0" w:color="auto"/>
+              <w:bottom w:val="none" w:sz="0" w:space="0" w:color="auto"/>
+              <w:right w:val="none" w:sz="0" w:space="0" w:color="auto"/>
+            </w:tcBorders>
+            <w:vAlign w:val="center"/>
+          </w:tcPr>
+          <w:p>
+            <w:pPr>
+              <w:spacing w:after="0" w:before="0" w:line="260" w:lineRule="exact"/>
+              <w:jc w:val="right"/>
+            </w:pPr>
+            <w:r>
+              <w:rPr>
+                <w:rFonts w:ascii="Times New Roman" w:hAnsi="Times New Roman"/>
+                <w:sz w:val="20"/>
+              </w:rPr>
+              <w:t>16:</w:t>
+            </w:r>
+          </w:p>
+        </w:tc>
+        <w:tc>
+          <w:tcPr>
+            <w:tcW w:type="dxa" w:w="7938"/>
+            <w:tcBorders>
+              <w:top w:val="none" w:sz="0" w:space="0" w:color="auto"/>
+              <w:left w:val="none" w:sz="0" w:space="0" w:color="auto"/>
+              <w:bottom w:val="none" w:sz="0" w:space="0" w:color="auto"/>
+              <w:right w:val="none" w:sz="0" w:space="0" w:color="auto"/>
+            </w:tcBorders>
+            <w:vAlign w:val="center"/>
+          </w:tcPr>
+          <w:p>
+            <w:pPr>
+              <w:spacing w:after="0" w:before="0" w:line="260" w:lineRule="exact"/>
+              <w:ind w:left="283"/>
+            </w:pPr>
+            <w:r>
+              <w:rPr>
+                <w:rFonts w:ascii="Times New Roman" w:hAnsi="Times New Roman"/>
+                <w:b/>
+                <w:i w:val="0"/>
+                <w:sz w:val="20"/>
+              </w:rPr>
+              <w:t>while</w:t>
+            </w:r>
+            <w:r>
+              <w:rPr>
+                <w:rFonts w:ascii="Times New Roman" w:hAnsi="Times New Roman"/>
+                <w:b w:val="0"/>
+                <w:i w:val="0"/>
+                <w:sz w:val="20"/>
+              </w:rPr>
+              <w:t xml:space="preserve"> decision = reject </w:t>
+            </w:r>
+            <w:r>
+              <w:rPr>
+                <w:rFonts w:ascii="Times New Roman" w:hAnsi="Times New Roman"/>
+                <w:b w:val="0"/>
+                <w:i w:val="0"/>
+                <w:sz w:val="20"/>
+              </w:rPr>
+              <w:t>∧</w:t>
+            </w:r>
+            <w:r>
+              <w:rPr>
+                <w:rFonts w:ascii="Times New Roman" w:hAnsi="Times New Roman"/>
+                <w:b w:val="0"/>
+                <w:i w:val="0"/>
+                <w:sz w:val="20"/>
+              </w:rPr>
+              <w:t xml:space="preserve"> retries &lt; retryLimit </w:t>
+            </w:r>
+            <w:r>
+              <w:rPr>
+                <w:rFonts w:ascii="Times New Roman" w:hAnsi="Times New Roman"/>
+                <w:b/>
+                <w:i w:val="0"/>
+                <w:sz w:val="20"/>
+              </w:rPr>
+              <w:t>do</w:t>
+            </w:r>
+          </w:p>
+        </w:tc>
+      </w:tr>
+      <w:tr>
+        <w:trPr>
+          <w:trHeight w:val="280" w:hRule="atLeast"/>
+        </w:trPr>
+        <w:tc>
+          <w:tcPr>
+            <w:tcW w:type="dxa" w:w="680"/>
+            <w:tcBorders>
+              <w:top w:val="none" w:sz="0" w:space="0" w:color="auto"/>
+              <w:left w:val="none" w:sz="0" w:space="0" w:color="auto"/>
+              <w:bottom w:val="none" w:sz="0" w:space="0" w:color="auto"/>
+              <w:right w:val="none" w:sz="0" w:space="0" w:color="auto"/>
+            </w:tcBorders>
+            <w:vAlign w:val="center"/>
+          </w:tcPr>
+          <w:p>
+            <w:pPr>
+              <w:spacing w:after="0" w:before="0" w:line="260" w:lineRule="exact"/>
+              <w:jc w:val="right"/>
+            </w:pPr>
+            <w:r>
+              <w:rPr>
+                <w:rFonts w:ascii="Times New Roman" w:hAnsi="Times New Roman"/>
+                <w:sz w:val="20"/>
+              </w:rPr>
+              <w:t>17:</w:t>
+            </w:r>
+          </w:p>
+        </w:tc>
+        <w:tc>
+          <w:tcPr>
+            <w:tcW w:type="dxa" w:w="7938"/>
+            <w:tcBorders>
+              <w:top w:val="none" w:sz="0" w:space="0" w:color="auto"/>
+              <w:left w:val="none" w:sz="0" w:space="0" w:color="auto"/>
+              <w:bottom w:val="none" w:sz="0" w:space="0" w:color="auto"/>
+              <w:right w:val="none" w:sz="0" w:space="0" w:color="auto"/>
+            </w:tcBorders>
+            <w:vAlign w:val="center"/>
+          </w:tcPr>
+          <w:p>
+            <w:pPr>
+              <w:spacing w:after="0" w:before="0" w:line="260" w:lineRule="exact"/>
+              <w:ind w:left="567"/>
+            </w:pPr>
+            <w:r>
+              <w:rPr>
+                <w:rFonts w:ascii="Times New Roman" w:hAnsi="Times New Roman"/>
+                <w:b w:val="0"/>
+                <w:i w:val="0"/>
+                <w:sz w:val="20"/>
+              </w:rPr>
+              <w:t xml:space="preserve">result </w:t>
+            </w:r>
+            <w:r>
+              <w:rPr>
+                <w:rFonts w:ascii="Times New Roman" w:hAnsi="Times New Roman"/>
+                <w:b w:val="0"/>
+                <w:i w:val="0"/>
+                <w:sz w:val="20"/>
+              </w:rPr>
+              <w:t>←</w:t>
+            </w:r>
+            <w:r>
+              <w:rPr>
+                <w:rFonts w:ascii="Times New Roman" w:hAnsi="Times New Roman"/>
+                <w:b w:val="0"/>
+                <w:i w:val="0"/>
+                <w:sz w:val="20"/>
+              </w:rPr>
+              <w:t xml:space="preserve"> TaskExecute(active, context);   retries </w:t>
+            </w:r>
+            <w:r>
+              <w:rPr>
+                <w:rFonts w:ascii="Times New Roman" w:hAnsi="Times New Roman"/>
+                <w:b w:val="0"/>
+                <w:i w:val="0"/>
+                <w:sz w:val="20"/>
+              </w:rPr>
+              <w:t>←</w:t>
+            </w:r>
+            <w:r>
+              <w:rPr>
+                <w:rFonts w:ascii="Times New Roman" w:hAnsi="Times New Roman"/>
+                <w:b w:val="0"/>
+                <w:i w:val="0"/>
+                <w:sz w:val="20"/>
+              </w:rPr>
+              <w:t xml:space="preserve"> retries + 1;   decision </w:t>
+            </w:r>
+            <w:r>
+              <w:rPr>
+                <w:rFonts w:ascii="Times New Roman" w:hAnsi="Times New Roman"/>
+                <w:b w:val="0"/>
+                <w:i w:val="0"/>
+                <w:sz w:val="20"/>
+              </w:rPr>
+              <w:t>←</w:t>
+            </w:r>
+            <w:r>
+              <w:rPr>
+                <w:rFonts w:ascii="Times New Roman" w:hAnsi="Times New Roman"/>
+                <w:b w:val="0"/>
+                <w:i w:val="0"/>
+                <w:sz w:val="20"/>
+              </w:rPr>
+              <w:t xml:space="preserve"> ResultReview(result)</w:t>
+            </w:r>
+          </w:p>
+        </w:tc>
+      </w:tr>
+      <w:tr>
+        <w:trPr>
+          <w:trHeight w:val="280" w:hRule="atLeast"/>
+        </w:trPr>
+        <w:tc>
+          <w:tcPr>
+            <w:tcW w:type="dxa" w:w="680"/>
+            <w:tcBorders>
+              <w:top w:val="none" w:sz="0" w:space="0" w:color="auto"/>
+              <w:left w:val="none" w:sz="0" w:space="0" w:color="auto"/>
+              <w:bottom w:val="none" w:sz="0" w:space="0" w:color="auto"/>
+              <w:right w:val="none" w:sz="0" w:space="0" w:color="auto"/>
+            </w:tcBorders>
+            <w:vAlign w:val="center"/>
+          </w:tcPr>
+          <w:p>
+            <w:pPr>
+              <w:spacing w:after="0" w:before="0" w:line="260" w:lineRule="exact"/>
+              <w:jc w:val="right"/>
+            </w:pPr>
+            <w:r>
+              <w:rPr>
+                <w:rFonts w:ascii="Times New Roman" w:hAnsi="Times New Roman"/>
+                <w:sz w:val="20"/>
+              </w:rPr>
+              <w:t>18:</w:t>
+            </w:r>
+          </w:p>
+        </w:tc>
+        <w:tc>
+          <w:tcPr>
+            <w:tcW w:type="dxa" w:w="7938"/>
+            <w:tcBorders>
+              <w:top w:val="none" w:sz="0" w:space="0" w:color="auto"/>
+              <w:left w:val="none" w:sz="0" w:space="0" w:color="auto"/>
+              <w:bottom w:val="none" w:sz="0" w:space="0" w:color="auto"/>
+              <w:right w:val="none" w:sz="0" w:space="0" w:color="auto"/>
+            </w:tcBorders>
+            <w:vAlign w:val="center"/>
+          </w:tcPr>
+          <w:p>
+            <w:pPr>
+              <w:spacing w:after="0" w:before="0" w:line="260" w:lineRule="exact"/>
+              <w:ind w:left="283"/>
+            </w:pPr>
+            <w:r>
+              <w:rPr>
+                <w:rFonts w:ascii="Times New Roman" w:hAnsi="Times New Roman"/>
+                <w:b/>
+                <w:i w:val="0"/>
+                <w:sz w:val="20"/>
+              </w:rPr>
+              <w:t>end</w:t>
+            </w:r>
+            <w:r>
+              <w:rPr>
+                <w:rFonts w:ascii="Times New Roman" w:hAnsi="Times New Roman"/>
+                <w:b w:val="0"/>
+                <w:i w:val="0"/>
+                <w:sz w:val="20"/>
+              </w:rPr>
+              <w:t xml:space="preserve"> </w:t>
+            </w:r>
+            <w:r>
+              <w:rPr>
+                <w:rFonts w:ascii="Times New Roman" w:hAnsi="Times New Roman"/>
+                <w:b/>
+                <w:i w:val="0"/>
+                <w:sz w:val="20"/>
+              </w:rPr>
+              <w:t>while</w:t>
+            </w:r>
+          </w:p>
+        </w:tc>
+      </w:tr>
+      <w:tr>
+        <w:trPr>
+          <w:trHeight w:val="280" w:hRule="atLeast"/>
+        </w:trPr>
+        <w:tc>
+          <w:tcPr>
+            <w:tcW w:type="dxa" w:w="680"/>
+            <w:tcBorders>
+              <w:top w:val="none" w:sz="0" w:space="0" w:color="auto"/>
+              <w:left w:val="none" w:sz="0" w:space="0" w:color="auto"/>
+              <w:bottom w:val="none" w:sz="0" w:space="0" w:color="auto"/>
+              <w:right w:val="none" w:sz="0" w:space="0" w:color="auto"/>
+            </w:tcBorders>
+            <w:vAlign w:val="center"/>
+          </w:tcPr>
+          <w:p>
+            <w:pPr>
+              <w:spacing w:after="0" w:before="0" w:line="260" w:lineRule="exact"/>
+              <w:jc w:val="right"/>
+            </w:pPr>
+            <w:r>
+              <w:rPr>
+                <w:rFonts w:ascii="Times New Roman" w:hAnsi="Times New Roman"/>
+                <w:sz w:val="20"/>
+              </w:rPr>
+              <w:t>19:</w:t>
+            </w:r>
+          </w:p>
+        </w:tc>
+        <w:tc>
+          <w:tcPr>
+            <w:tcW w:type="dxa" w:w="7938"/>
+            <w:tcBorders>
+              <w:top w:val="none" w:sz="0" w:space="0" w:color="auto"/>
+              <w:left w:val="none" w:sz="0" w:space="0" w:color="auto"/>
+              <w:bottom w:val="none" w:sz="0" w:space="0" w:color="auto"/>
+              <w:right w:val="none" w:sz="0" w:space="0" w:color="auto"/>
+            </w:tcBorders>
+            <w:vAlign w:val="center"/>
+          </w:tcPr>
+          <w:p>
+            <w:pPr>
+              <w:spacing w:after="0" w:before="0" w:line="260" w:lineRule="exact"/>
+              <w:ind w:left="283"/>
+            </w:pPr>
+            <w:r>
+              <w:rPr>
+                <w:rFonts w:ascii="Times New Roman" w:hAnsi="Times New Roman"/>
+                <w:b/>
+                <w:i w:val="0"/>
+                <w:sz w:val="20"/>
+              </w:rPr>
+              <w:t>if</w:t>
+            </w:r>
+            <w:r>
+              <w:rPr>
+                <w:rFonts w:ascii="Times New Roman" w:hAnsi="Times New Roman"/>
+                <w:b w:val="0"/>
+                <w:i w:val="0"/>
+                <w:sz w:val="20"/>
+              </w:rPr>
+              <w:t xml:space="preserve"> decision = replan </w:t>
+            </w:r>
+            <w:r>
+              <w:rPr>
+                <w:rFonts w:ascii="Times New Roman" w:hAnsi="Times New Roman"/>
+                <w:b/>
+                <w:i w:val="0"/>
+                <w:sz w:val="20"/>
+              </w:rPr>
+              <w:t>then</w:t>
+            </w:r>
+          </w:p>
+        </w:tc>
+      </w:tr>
+      <w:tr>
+        <w:trPr>
+          <w:trHeight w:val="280" w:hRule="atLeast"/>
+        </w:trPr>
+        <w:tc>
+          <w:tcPr>
+            <w:tcW w:type="dxa" w:w="680"/>
+            <w:tcBorders>
+              <w:top w:val="none" w:sz="0" w:space="0" w:color="auto"/>
+              <w:left w:val="none" w:sz="0" w:space="0" w:color="auto"/>
+              <w:bottom w:val="none" w:sz="0" w:space="0" w:color="auto"/>
+              <w:right w:val="none" w:sz="0" w:space="0" w:color="auto"/>
+            </w:tcBorders>
+            <w:vAlign w:val="center"/>
+          </w:tcPr>
+          <w:p>
+            <w:pPr>
+              <w:spacing w:after="0" w:before="0" w:line="260" w:lineRule="exact"/>
+              <w:jc w:val="right"/>
+            </w:pPr>
+            <w:r>
+              <w:rPr>
+                <w:rFonts w:ascii="Times New Roman" w:hAnsi="Times New Roman"/>
+                <w:sz w:val="20"/>
+              </w:rPr>
+              <w:t>20:</w:t>
+            </w:r>
+          </w:p>
+        </w:tc>
+        <w:tc>
+          <w:tcPr>
+            <w:tcW w:type="dxa" w:w="7938"/>
+            <w:tcBorders>
+              <w:top w:val="none" w:sz="0" w:space="0" w:color="auto"/>
+              <w:left w:val="none" w:sz="0" w:space="0" w:color="auto"/>
+              <w:bottom w:val="none" w:sz="0" w:space="0" w:color="auto"/>
+              <w:right w:val="none" w:sz="0" w:space="0" w:color="auto"/>
+            </w:tcBorders>
+            <w:vAlign w:val="center"/>
+          </w:tcPr>
+          <w:p>
+            <w:pPr>
+              <w:spacing w:after="0" w:before="0" w:line="260" w:lineRule="exact"/>
+              <w:ind w:left="567"/>
+            </w:pPr>
+            <w:r>
+              <w:rPr>
+                <w:rFonts w:ascii="Times New Roman" w:hAnsi="Times New Roman"/>
+                <w:b w:val="0"/>
+                <w:i w:val="0"/>
+                <w:sz w:val="20"/>
+              </w:rPr>
+              <w:t xml:space="preserve">TaskAssess(active);   TaskAnalyze(active, replan);   result </w:t>
+            </w:r>
+            <w:r>
+              <w:rPr>
+                <w:rFonts w:ascii="Times New Roman" w:hAnsi="Times New Roman"/>
+                <w:b w:val="0"/>
+                <w:i w:val="0"/>
+                <w:sz w:val="20"/>
+              </w:rPr>
+              <w:t>←</w:t>
+            </w:r>
+            <w:r>
+              <w:rPr>
+                <w:rFonts w:ascii="Times New Roman" w:hAnsi="Times New Roman"/>
+                <w:b w:val="0"/>
+                <w:i w:val="0"/>
+                <w:sz w:val="20"/>
+              </w:rPr>
+              <w:t xml:space="preserve"> TaskExecute(active, context)</w:t>
+            </w:r>
+          </w:p>
+        </w:tc>
+      </w:tr>
+      <w:tr>
+        <w:trPr>
+          <w:trHeight w:val="280" w:hRule="atLeast"/>
+        </w:trPr>
+        <w:tc>
+          <w:tcPr>
+            <w:tcW w:type="dxa" w:w="680"/>
+            <w:tcBorders>
+              <w:top w:val="none" w:sz="0" w:space="0" w:color="auto"/>
+              <w:left w:val="none" w:sz="0" w:space="0" w:color="auto"/>
+              <w:bottom w:val="none" w:sz="0" w:space="0" w:color="auto"/>
+              <w:right w:val="none" w:sz="0" w:space="0" w:color="auto"/>
+            </w:tcBorders>
+            <w:vAlign w:val="center"/>
+          </w:tcPr>
+          <w:p>
+            <w:pPr>
+              <w:spacing w:after="0" w:before="0" w:line="260" w:lineRule="exact"/>
+              <w:jc w:val="right"/>
+            </w:pPr>
+            <w:r>
+              <w:rPr>
+                <w:rFonts w:ascii="Times New Roman" w:hAnsi="Times New Roman"/>
+                <w:sz w:val="20"/>
+              </w:rPr>
+              <w:t>21:</w:t>
+            </w:r>
+          </w:p>
+        </w:tc>
+        <w:tc>
+          <w:tcPr>
+            <w:tcW w:type="dxa" w:w="7938"/>
+            <w:tcBorders>
+              <w:top w:val="none" w:sz="0" w:space="0" w:color="auto"/>
+              <w:left w:val="none" w:sz="0" w:space="0" w:color="auto"/>
+              <w:bottom w:val="none" w:sz="0" w:space="0" w:color="auto"/>
+              <w:right w:val="none" w:sz="0" w:space="0" w:color="auto"/>
+            </w:tcBorders>
+            <w:vAlign w:val="center"/>
+          </w:tcPr>
+          <w:p>
+            <w:pPr>
+              <w:spacing w:after="0" w:before="0" w:line="260" w:lineRule="exact"/>
+              <w:ind w:left="283"/>
+            </w:pPr>
+            <w:r>
+              <w:rPr>
+                <w:rFonts w:ascii="Times New Roman" w:hAnsi="Times New Roman"/>
+                <w:b/>
+                <w:i w:val="0"/>
+                <w:sz w:val="20"/>
+              </w:rPr>
+              <w:t>if</w:t>
+            </w:r>
+            <w:r>
+              <w:rPr>
+                <w:rFonts w:ascii="Times New Roman" w:hAnsi="Times New Roman"/>
+                <w:b w:val="0"/>
+                <w:i w:val="0"/>
+                <w:sz w:val="20"/>
+              </w:rPr>
+              <w:t xml:space="preserve"> decision = accept </w:t>
+            </w:r>
+            <w:r>
+              <w:rPr>
+                <w:rFonts w:ascii="Times New Roman" w:hAnsi="Times New Roman"/>
+                <w:b/>
+                <w:i w:val="0"/>
+                <w:sz w:val="20"/>
+              </w:rPr>
+              <w:t>then</w:t>
+            </w:r>
+          </w:p>
+        </w:tc>
+      </w:tr>
+      <w:tr>
+        <w:trPr>
+          <w:trHeight w:val="280" w:hRule="atLeast"/>
+        </w:trPr>
+        <w:tc>
+          <w:tcPr>
+            <w:tcW w:type="dxa" w:w="680"/>
+            <w:tcBorders>
+              <w:top w:val="none" w:sz="0" w:space="0" w:color="auto"/>
+              <w:left w:val="none" w:sz="0" w:space="0" w:color="auto"/>
+              <w:bottom w:val="none" w:sz="0" w:space="0" w:color="auto"/>
+              <w:right w:val="none" w:sz="0" w:space="0" w:color="auto"/>
+            </w:tcBorders>
+            <w:vAlign w:val="center"/>
+          </w:tcPr>
+          <w:p>
+            <w:pPr>
+              <w:spacing w:after="0" w:before="0" w:line="260" w:lineRule="exact"/>
+              <w:jc w:val="right"/>
+            </w:pPr>
+            <w:r>
+              <w:rPr>
+                <w:rFonts w:ascii="Times New Roman" w:hAnsi="Times New Roman"/>
+                <w:sz w:val="20"/>
+              </w:rPr>
+              <w:t>22:</w:t>
+            </w:r>
+          </w:p>
+        </w:tc>
+        <w:tc>
+          <w:tcPr>
+            <w:tcW w:type="dxa" w:w="7938"/>
+            <w:tcBorders>
+              <w:top w:val="none" w:sz="0" w:space="0" w:color="auto"/>
+              <w:left w:val="none" w:sz="0" w:space="0" w:color="auto"/>
+              <w:bottom w:val="none" w:sz="0" w:space="0" w:color="auto"/>
+              <w:right w:val="none" w:sz="0" w:space="0" w:color="auto"/>
+            </w:tcBorders>
+            <w:vAlign w:val="center"/>
+          </w:tcPr>
+          <w:p>
+            <w:pPr>
+              <w:spacing w:after="0" w:before="0" w:line="260" w:lineRule="exact"/>
+              <w:ind w:left="567"/>
+            </w:pPr>
+            <w:r>
+              <w:rPr>
+                <w:rFonts w:ascii="Times New Roman" w:hAnsi="Times New Roman"/>
+                <w:b w:val="0"/>
+                <w:i w:val="0"/>
+                <w:sz w:val="20"/>
+              </w:rPr>
+              <w:t xml:space="preserve">completedResults </w:t>
+            </w:r>
+            <w:r>
+              <w:rPr>
+                <w:rFonts w:ascii="Times New Roman" w:hAnsi="Times New Roman"/>
+                <w:b w:val="0"/>
+                <w:i w:val="0"/>
+                <w:sz w:val="20"/>
+              </w:rPr>
+              <w:t>←</w:t>
+            </w:r>
+            <w:r>
+              <w:rPr>
+                <w:rFonts w:ascii="Times New Roman" w:hAnsi="Times New Roman"/>
+                <w:b w:val="0"/>
+                <w:i w:val="0"/>
+                <w:sz w:val="20"/>
+              </w:rPr>
+              <w:t xml:space="preserve"> completedResults </w:t>
+            </w:r>
+            <w:r>
+              <w:rPr>
+                <w:rFonts w:ascii="Times New Roman" w:hAnsi="Times New Roman"/>
+                <w:b w:val="0"/>
+                <w:i w:val="0"/>
+                <w:sz w:val="20"/>
+              </w:rPr>
+              <w:t>∪</w:t>
+            </w:r>
+            <w:r>
+              <w:rPr>
+                <w:rFonts w:ascii="Times New Roman" w:hAnsi="Times New Roman"/>
+                <w:b w:val="0"/>
+                <w:i w:val="0"/>
+                <w:sz w:val="20"/>
+              </w:rPr>
+              <w:t xml:space="preserve"> {result};   active </w:t>
+            </w:r>
+            <w:r>
+              <w:rPr>
+                <w:rFonts w:ascii="Times New Roman" w:hAnsi="Times New Roman"/>
+                <w:b w:val="0"/>
+                <w:i w:val="0"/>
+                <w:sz w:val="20"/>
+              </w:rPr>
+              <w:t>←</w:t>
+            </w:r>
+            <w:r>
+              <w:rPr>
+                <w:rFonts w:ascii="Times New Roman" w:hAnsi="Times New Roman"/>
+                <w:b w:val="0"/>
+                <w:i w:val="0"/>
+                <w:sz w:val="20"/>
+              </w:rPr>
+              <w:t xml:space="preserve"> NextTask(rootTask)</w:t>
+            </w:r>
+          </w:p>
+        </w:tc>
+      </w:tr>
+      <w:tr>
+        <w:trPr>
+          <w:trHeight w:val="280" w:hRule="atLeast"/>
+        </w:trPr>
+        <w:tc>
+          <w:tcPr>
+            <w:tcW w:type="dxa" w:w="680"/>
+            <w:tcBorders>
+              <w:top w:val="none" w:sz="0" w:space="0" w:color="auto"/>
+              <w:left w:val="none" w:sz="0" w:space="0" w:color="auto"/>
+              <w:bottom w:val="none" w:sz="0" w:space="0" w:color="auto"/>
+              <w:right w:val="none" w:sz="0" w:space="0" w:color="auto"/>
+            </w:tcBorders>
+            <w:vAlign w:val="center"/>
+          </w:tcPr>
+          <w:p>
+            <w:pPr>
+              <w:spacing w:after="0" w:before="0" w:line="260" w:lineRule="exact"/>
+              <w:jc w:val="right"/>
+            </w:pPr>
+            <w:r>
+              <w:rPr>
+                <w:rFonts w:ascii="Times New Roman" w:hAnsi="Times New Roman"/>
+                <w:sz w:val="20"/>
+              </w:rPr>
+              <w:t>23:</w:t>
+            </w:r>
+          </w:p>
+        </w:tc>
+        <w:tc>
+          <w:tcPr>
+            <w:tcW w:type="dxa" w:w="7938"/>
+            <w:tcBorders>
+              <w:top w:val="none" w:sz="0" w:space="0" w:color="auto"/>
+              <w:left w:val="none" w:sz="0" w:space="0" w:color="auto"/>
+              <w:bottom w:val="none" w:sz="0" w:space="0" w:color="auto"/>
+              <w:right w:val="none" w:sz="0" w:space="0" w:color="auto"/>
+            </w:tcBorders>
+            <w:vAlign w:val="center"/>
+          </w:tcPr>
+          <w:p>
+            <w:pPr>
+              <w:spacing w:after="0" w:before="0" w:line="260" w:lineRule="exact"/>
+            </w:pPr>
+            <w:r>
+              <w:rPr>
+                <w:rFonts w:ascii="Times New Roman" w:hAnsi="Times New Roman"/>
+                <w:b/>
+                <w:i w:val="0"/>
+                <w:sz w:val="20"/>
+              </w:rPr>
+              <w:t>end</w:t>
+            </w:r>
+            <w:r>
+              <w:rPr>
+                <w:rFonts w:ascii="Times New Roman" w:hAnsi="Times New Roman"/>
+                <w:b w:val="0"/>
+                <w:i w:val="0"/>
+                <w:sz w:val="20"/>
+              </w:rPr>
+              <w:t xml:space="preserve"> </w:t>
+            </w:r>
+            <w:r>
+              <w:rPr>
+                <w:rFonts w:ascii="Times New Roman" w:hAnsi="Times New Roman"/>
+                <w:b/>
+                <w:i w:val="0"/>
+                <w:sz w:val="20"/>
+              </w:rPr>
+              <w:t>while</w:t>
+            </w:r>
+          </w:p>
+        </w:tc>
+      </w:tr>
+      <w:tr>
+        <w:trPr>
+          <w:trHeight w:val="160" w:hRule="atLeast"/>
+        </w:trPr>
+        <w:tc>
+          <w:tcPr>
+            <w:tcW w:type="dxa" w:w="680"/>
+            <w:tcBorders>
+              <w:top w:val="none" w:sz="0" w:space="0" w:color="auto"/>
+              <w:left w:val="none" w:sz="0" w:space="0" w:color="auto"/>
+              <w:bottom w:val="none" w:sz="0" w:space="0" w:color="auto"/>
+              <w:right w:val="none" w:sz="0" w:space="0" w:color="auto"/>
+            </w:tcBorders>
+            <w:vAlign w:val="center"/>
+          </w:tcPr>
+          <w:p/>
+        </w:tc>
+        <w:tc>
+          <w:tcPr>
+            <w:tcW w:type="dxa" w:w="7938"/>
+            <w:tcBorders>
+              <w:top w:val="none" w:sz="0" w:space="0" w:color="auto"/>
+              <w:left w:val="none" w:sz="0" w:space="0" w:color="auto"/>
+              <w:bottom w:val="none" w:sz="0" w:space="0" w:color="auto"/>
+              <w:right w:val="none" w:sz="0" w:space="0" w:color="auto"/>
+            </w:tcBorders>
+            <w:vAlign w:val="center"/>
+          </w:tcPr>
+          <w:p>
+            <w:pPr>
+              <w:spacing w:after="0" w:before="0" w:line="260" w:lineRule="exact"/>
+            </w:pPr>
+            <w:r>
+              <w:rPr>
+                <w:rFonts w:ascii="Times New Roman" w:hAnsi="Times New Roman"/>
+                <w:b w:val="0"/>
+                <w:color w:val="808080"/>
+                <w:sz w:val="20"/>
+              </w:rPr>
+              <w:t>// Step 5: Aggregate Results</w:t>
+            </w:r>
+          </w:p>
+        </w:tc>
+      </w:tr>
+      <w:tr>
+        <w:trPr>
+          <w:trHeight w:val="280" w:hRule="atLeast"/>
+        </w:trPr>
+        <w:tc>
+          <w:tcPr>
+            <w:tcW w:type="dxa" w:w="680"/>
+            <w:tcBorders>
+              <w:top w:val="none" w:sz="0" w:space="0" w:color="auto"/>
+              <w:left w:val="none" w:sz="0" w:space="0" w:color="auto"/>
+              <w:bottom w:val="none" w:sz="0" w:space="0" w:color="auto"/>
+              <w:right w:val="none" w:sz="0" w:space="0" w:color="auto"/>
+            </w:tcBorders>
+            <w:vAlign w:val="center"/>
+          </w:tcPr>
+          <w:p>
+            <w:pPr>
+              <w:spacing w:after="0" w:before="0" w:line="260" w:lineRule="exact"/>
+              <w:jc w:val="right"/>
+            </w:pPr>
+            <w:r>
+              <w:rPr>
+                <w:rFonts w:ascii="Times New Roman" w:hAnsi="Times New Roman"/>
+                <w:sz w:val="20"/>
+              </w:rPr>
+              <w:t>24:</w:t>
+            </w:r>
+          </w:p>
+        </w:tc>
+        <w:tc>
+          <w:tcPr>
+            <w:tcW w:type="dxa" w:w="7938"/>
+            <w:tcBorders>
+              <w:top w:val="none" w:sz="0" w:space="0" w:color="auto"/>
+              <w:left w:val="none" w:sz="0" w:space="0" w:color="auto"/>
+              <w:bottom w:val="none" w:sz="0" w:space="0" w:color="auto"/>
+              <w:right w:val="none" w:sz="0" w:space="0" w:color="auto"/>
+            </w:tcBorders>
+            <w:vAlign w:val="center"/>
+          </w:tcPr>
+          <w:p>
+            <w:pPr>
+              <w:spacing w:after="0" w:before="0" w:line="260" w:lineRule="exact"/>
+            </w:pPr>
+            <w:r>
+              <w:rPr>
+                <w:rFonts w:ascii="Times New Roman" w:hAnsi="Times New Roman"/>
+                <w:b w:val="0"/>
+                <w:i w:val="0"/>
+                <w:sz w:val="20"/>
+              </w:rPr>
+              <w:t xml:space="preserve">aggregatedResult </w:t>
+            </w:r>
+            <w:r>
+              <w:rPr>
+                <w:rFonts w:ascii="Times New Roman" w:hAnsi="Times New Roman"/>
+                <w:b w:val="0"/>
+                <w:i w:val="0"/>
+                <w:sz w:val="20"/>
+              </w:rPr>
+              <w:t>←</w:t>
+            </w:r>
+            <w:r>
+              <w:rPr>
+                <w:rFonts w:ascii="Times New Roman" w:hAnsi="Times New Roman"/>
+                <w:b w:val="0"/>
+                <w:i w:val="0"/>
+                <w:sz w:val="20"/>
+              </w:rPr>
+              <w:t xml:space="preserve"> Aggregate(rootTask)</w:t>
+            </w:r>
+          </w:p>
+        </w:tc>
+      </w:tr>
+    </w:tbl>
     <w:p>
       <w:pPr>
         <w:spacing w:after="0" w:before="0"/>
@@ -1930,6 +2591,9 @@
     <w:name w:val="Normal"/>
     <w:qFormat/>
     <w:rsid w:val="00FC693F"/>
+    <w:pPr>
+      <w:spacing w:after="0" w:before="0" w:line="260" w:lineRule="exact"/>
+    </w:pPr>
     <w:rPr>
       <w:rFonts w:ascii="Times New Roman" w:hAnsi="Times New Roman"/>
       <w:sz w:val="20"/>

</xml_diff>